<commit_message>
new feature added - version 1.4
</commit_message>
<xml_diff>
--- a/docs/SIM4LON_Journal_Draft_v2.docx
+++ b/docs/SIM4LON_Journal_Draft_v2.docx
@@ -43,7 +43,7 @@
           <w:rFonts w:ascii="Times New Roman" w:hAnsi="Times New Roman" w:cs="Times New Roman"/>
         </w:rPr>
         <w:pict w14:anchorId="754E0863">
-          <v:rect id="_x0000_i1025" style="width:0;height:1.5pt" o:hralign="center" o:hrstd="t" o:hr="t"/>
+          <v:rect id="_x0000_i2422" style="width:0;height:1.5pt" o:hralign="center" o:hrstd="t" o:hr="t"/>
         </w:pict>
       </w:r>
     </w:p>
@@ -238,7 +238,7 @@
           <w:rFonts w:ascii="Times New Roman" w:hAnsi="Times New Roman" w:cs="Times New Roman"/>
         </w:rPr>
         <w:pict w14:anchorId="4DA4C728">
-          <v:rect id="_x0000_i1026" style="width:0;height:1.5pt" o:hralign="center" o:hrstd="t" o:hr="t"/>
+          <v:rect id="_x0000_i2423" style="width:0;height:1.5pt" o:hralign="center" o:hrstd="t" o:hr="t"/>
         </w:pict>
       </w:r>
     </w:p>
@@ -1893,7 +1893,7 @@
           <w:rFonts w:ascii="Times New Roman" w:hAnsi="Times New Roman" w:cs="Times New Roman"/>
         </w:rPr>
         <w:pict w14:anchorId="457939D9">
-          <v:rect id="_x0000_i1027" style="width:0;height:1.5pt" o:hralign="center" o:hrstd="t" o:hr="t"/>
+          <v:rect id="_x0000_i2424" style="width:0;height:1.5pt" o:hralign="center" o:hrstd="t" o:hr="t"/>
         </w:pict>
       </w:r>
     </w:p>
@@ -9826,7 +9826,7 @@
           <w:rFonts w:ascii="Times New Roman" w:hAnsi="Times New Roman" w:cs="Times New Roman"/>
         </w:rPr>
         <w:pict w14:anchorId="4A738CAA">
-          <v:rect id="_x0000_i1028" style="width:0;height:1.5pt" o:hralign="center" o:hrstd="t" o:hr="t"/>
+          <v:rect id="_x0000_i2425" style="width:0;height:1.5pt" o:hralign="center" o:hrstd="t" o:hr="t"/>
         </w:pict>
       </w:r>
     </w:p>
@@ -10240,7 +10240,7 @@
             <w:sz w:val="22"/>
             <w:szCs w:val="22"/>
           </w:rPr>
-          <w:tag w:val="MENDELEY_CITATION_v3_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"/>
+          <w:tag w:val="MENDELEY_CITATION_v3_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"/>
           <w:id w:val="-1287813640"/>
           <w:placeholder>
             <w:docPart w:val="DefaultPlaceholder_-1854013440"/>
@@ -10534,7 +10534,40 @@
           <w:sz w:val="22"/>
           <w:szCs w:val="22"/>
         </w:rPr>
-        <w:t xml:space="preserve"> [10].</w:t>
+        <w:t xml:space="preserve"> </w:t>
+      </w:r>
+      <w:sdt>
+        <w:sdtPr>
+          <w:rPr>
+            <w:rFonts w:ascii="Times New Roman" w:hAnsi="Times New Roman" w:cs="Times New Roman"/>
+            <w:color w:val="000000"/>
+            <w:sz w:val="22"/>
+            <w:szCs w:val="22"/>
+          </w:rPr>
+          <w:tag w:val="MENDELEY_CITATION_v3_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"/>
+          <w:id w:val="848295530"/>
+          <w:placeholder>
+            <w:docPart w:val="DefaultPlaceholder_-1854013440"/>
+          </w:placeholder>
+        </w:sdtPr>
+        <w:sdtContent>
+          <w:r>
+            <w:rPr>
+              <w:rFonts w:ascii="Times New Roman" w:eastAsia="Times New Roman" w:hAnsi="Times New Roman" w:cs="Times New Roman"/>
+              <w:color w:val="000000"/>
+              <w:sz w:val="22"/>
+            </w:rPr>
+            <w:t>[10]</w:t>
+          </w:r>
+        </w:sdtContent>
+      </w:sdt>
+      <w:r>
+        <w:rPr>
+          <w:rFonts w:ascii="Times New Roman" w:hAnsi="Times New Roman" w:cs="Times New Roman"/>
+          <w:sz w:val="22"/>
+          <w:szCs w:val="22"/>
+        </w:rPr>
+        <w:t>.</w:t>
       </w:r>
     </w:p>
     <w:p>
@@ -11140,7 +11173,41 @@
           <w:sz w:val="22"/>
           <w:szCs w:val="22"/>
         </w:rPr>
-        <w:t xml:space="preserve"> [2]. </w:t>
+        <w:t xml:space="preserve"> </w:t>
+      </w:r>
+      <w:sdt>
+        <w:sdtPr>
+          <w:rPr>
+            <w:rFonts w:ascii="Times New Roman" w:hAnsi="Times New Roman" w:cs="Times New Roman"/>
+            <w:color w:val="000000"/>
+            <w:sz w:val="22"/>
+            <w:szCs w:val="22"/>
+          </w:rPr>
+          <w:tag w:val="MENDELEY_CITATION_v3_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"/>
+          <w:id w:val="-1918394058"/>
+          <w:placeholder>
+            <w:docPart w:val="DefaultPlaceholder_-1854013440"/>
+          </w:placeholder>
+        </w:sdtPr>
+        <w:sdtContent>
+          <w:r>
+            <w:rPr>
+              <w:rFonts w:ascii="Times New Roman" w:hAnsi="Times New Roman" w:cs="Times New Roman"/>
+              <w:color w:val="000000"/>
+              <w:sz w:val="22"/>
+              <w:szCs w:val="22"/>
+            </w:rPr>
+            <w:t>[3]</w:t>
+          </w:r>
+        </w:sdtContent>
+      </w:sdt>
+      <w:r>
+        <w:rPr>
+          <w:rFonts w:ascii="Times New Roman" w:hAnsi="Times New Roman" w:cs="Times New Roman"/>
+          <w:sz w:val="22"/>
+          <w:szCs w:val="22"/>
+        </w:rPr>
+        <w:t xml:space="preserve">. </w:t>
       </w:r>
       <w:proofErr w:type="spellStart"/>
       <w:r>
@@ -12212,7 +12279,53 @@
           <w:szCs w:val="22"/>
           <w:lang w:val="nl-BE"/>
         </w:rPr>
-        <w:t xml:space="preserve"> stok [11].</w:t>
+        <w:t xml:space="preserve"> stok</w:t>
+      </w:r>
+      <w:r>
+        <w:rPr>
+          <w:rFonts w:ascii="Times New Roman" w:hAnsi="Times New Roman" w:cs="Times New Roman"/>
+          <w:sz w:val="22"/>
+          <w:szCs w:val="22"/>
+          <w:lang w:val="nl-BE"/>
+        </w:rPr>
+        <w:t xml:space="preserve"> </w:t>
+      </w:r>
+      <w:sdt>
+        <w:sdtPr>
+          <w:rPr>
+            <w:rFonts w:ascii="Times New Roman" w:hAnsi="Times New Roman" w:cs="Times New Roman"/>
+            <w:color w:val="000000"/>
+            <w:sz w:val="22"/>
+            <w:szCs w:val="22"/>
+            <w:lang w:val="nl-BE"/>
+          </w:rPr>
+          <w:tag w:val="MENDELEY_CITATION_v3_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"/>
+          <w:id w:val="-1672020989"/>
+          <w:placeholder>
+            <w:docPart w:val="DefaultPlaceholder_-1854013440"/>
+          </w:placeholder>
+        </w:sdtPr>
+        <w:sdtContent>
+          <w:r>
+            <w:rPr>
+              <w:rFonts w:ascii="Times New Roman" w:hAnsi="Times New Roman" w:cs="Times New Roman"/>
+              <w:color w:val="000000"/>
+              <w:sz w:val="22"/>
+              <w:szCs w:val="22"/>
+              <w:lang w:val="nl-BE"/>
+            </w:rPr>
+            <w:t>[11]</w:t>
+          </w:r>
+        </w:sdtContent>
+      </w:sdt>
+      <w:r>
+        <w:rPr>
+          <w:rFonts w:ascii="Times New Roman" w:hAnsi="Times New Roman" w:cs="Times New Roman"/>
+          <w:sz w:val="22"/>
+          <w:szCs w:val="22"/>
+          <w:lang w:val="nl-BE"/>
+        </w:rPr>
+        <w:t>.</w:t>
       </w:r>
     </w:p>
     <w:p>
@@ -12397,16 +12510,15 @@
     <w:tbl>
       <w:tblPr>
         <w:tblStyle w:val="Table"/>
-        <w:tblW w:w="5000" w:type="pct"/>
-        <w:tblLayout w:type="fixed"/>
+        <w:tblW w:w="4858" w:type="dxa"/>
         <w:tblLook w:val="0020" w:firstRow="1" w:lastRow="0" w:firstColumn="0" w:lastColumn="0" w:noHBand="0" w:noVBand="0"/>
       </w:tblPr>
       <w:tblGrid>
-        <w:gridCol w:w="466"/>
-        <w:gridCol w:w="1710"/>
-        <w:gridCol w:w="733"/>
-        <w:gridCol w:w="1088"/>
-        <w:gridCol w:w="733"/>
+        <w:gridCol w:w="510"/>
+        <w:gridCol w:w="1150"/>
+        <w:gridCol w:w="1696"/>
+        <w:gridCol w:w="1203"/>
+        <w:gridCol w:w="1603"/>
       </w:tblGrid>
       <w:tr>
         <w:trPr>
@@ -12415,13 +12527,14 @@
         </w:trPr>
         <w:tc>
           <w:tcPr>
-            <w:tcW w:w="674" w:type="dxa"/>
-          </w:tcPr>
-          <w:p>
-            <w:pPr>
-              <w:pStyle w:val="Compact"/>
-              <w:spacing w:line="276" w:lineRule="auto"/>
-              <w:jc w:val="both"/>
+            <w:tcW w:w="0" w:type="auto"/>
+            <w:vAlign w:val="top"/>
+          </w:tcPr>
+          <w:p>
+            <w:pPr>
+              <w:pStyle w:val="Compact"/>
+              <w:spacing w:line="276" w:lineRule="auto"/>
+              <w:jc w:val="center"/>
               <w:rPr>
                 <w:rFonts w:ascii="Times New Roman" w:hAnsi="Times New Roman" w:cs="Times New Roman"/>
               </w:rPr>
@@ -12436,13 +12549,14 @@
         </w:tc>
         <w:tc>
           <w:tcPr>
-            <w:tcW w:w="3033" w:type="dxa"/>
-          </w:tcPr>
-          <w:p>
-            <w:pPr>
-              <w:pStyle w:val="Compact"/>
-              <w:spacing w:line="276" w:lineRule="auto"/>
-              <w:jc w:val="both"/>
+            <w:tcW w:w="1106" w:type="dxa"/>
+            <w:vAlign w:val="top"/>
+          </w:tcPr>
+          <w:p>
+            <w:pPr>
+              <w:pStyle w:val="Compact"/>
+              <w:spacing w:line="276" w:lineRule="auto"/>
+              <w:jc w:val="center"/>
               <w:rPr>
                 <w:rFonts w:ascii="Times New Roman" w:hAnsi="Times New Roman" w:cs="Times New Roman"/>
               </w:rPr>
@@ -12479,13 +12593,14 @@
         </w:tc>
         <w:tc>
           <w:tcPr>
-            <w:tcW w:w="1179" w:type="dxa"/>
-          </w:tcPr>
-          <w:p>
-            <w:pPr>
-              <w:pStyle w:val="Compact"/>
-              <w:spacing w:line="276" w:lineRule="auto"/>
-              <w:jc w:val="both"/>
+            <w:tcW w:w="0" w:type="auto"/>
+            <w:vAlign w:val="top"/>
+          </w:tcPr>
+          <w:p>
+            <w:pPr>
+              <w:pStyle w:val="Compact"/>
+              <w:spacing w:line="276" w:lineRule="auto"/>
+              <w:jc w:val="center"/>
               <w:rPr>
                 <w:rFonts w:ascii="Times New Roman" w:hAnsi="Times New Roman" w:cs="Times New Roman"/>
               </w:rPr>
@@ -12502,13 +12617,14 @@
         </w:tc>
         <w:tc>
           <w:tcPr>
-            <w:tcW w:w="1853" w:type="dxa"/>
-          </w:tcPr>
-          <w:p>
-            <w:pPr>
-              <w:pStyle w:val="Compact"/>
-              <w:spacing w:line="276" w:lineRule="auto"/>
-              <w:jc w:val="both"/>
+            <w:tcW w:w="0" w:type="auto"/>
+            <w:vAlign w:val="top"/>
+          </w:tcPr>
+          <w:p>
+            <w:pPr>
+              <w:pStyle w:val="Compact"/>
+              <w:spacing w:line="276" w:lineRule="auto"/>
+              <w:jc w:val="center"/>
               <w:rPr>
                 <w:rFonts w:ascii="Times New Roman" w:hAnsi="Times New Roman" w:cs="Times New Roman"/>
               </w:rPr>
@@ -12525,13 +12641,14 @@
         </w:tc>
         <w:tc>
           <w:tcPr>
-            <w:tcW w:w="1179" w:type="dxa"/>
-          </w:tcPr>
-          <w:p>
-            <w:pPr>
-              <w:pStyle w:val="Compact"/>
-              <w:spacing w:line="276" w:lineRule="auto"/>
-              <w:jc w:val="both"/>
+            <w:tcW w:w="0" w:type="auto"/>
+            <w:vAlign w:val="top"/>
+          </w:tcPr>
+          <w:p>
+            <w:pPr>
+              <w:pStyle w:val="Compact"/>
+              <w:spacing w:line="276" w:lineRule="auto"/>
+              <w:jc w:val="center"/>
               <w:rPr>
                 <w:rFonts w:ascii="Times New Roman" w:hAnsi="Times New Roman" w:cs="Times New Roman"/>
               </w:rPr>
@@ -12548,7 +12665,7 @@
       <w:tr>
         <w:tc>
           <w:tcPr>
-            <w:tcW w:w="674" w:type="dxa"/>
+            <w:tcW w:w="0" w:type="auto"/>
           </w:tcPr>
           <w:p>
             <w:pPr>
@@ -12569,7 +12686,89 @@
         </w:tc>
         <w:tc>
           <w:tcPr>
-            <w:tcW w:w="3033" w:type="dxa"/>
+            <w:tcW w:w="1106" w:type="dxa"/>
+          </w:tcPr>
+          <w:sdt>
+            <w:sdtPr>
+              <w:rPr>
+                <w:rFonts w:ascii="Times New Roman" w:hAnsi="Times New Roman" w:cs="Times New Roman"/>
+                <w:color w:val="000000"/>
+              </w:rPr>
+              <w:tag w:val="MENDELEY_CITATION_v3_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"/>
+              <w:id w:val="838660252"/>
+              <w:placeholder>
+                <w:docPart w:val="DefaultPlaceholder_-1854013440"/>
+              </w:placeholder>
+            </w:sdtPr>
+            <w:sdtContent>
+              <w:p>
+                <w:pPr>
+                  <w:pStyle w:val="Compact"/>
+                  <w:spacing w:line="276" w:lineRule="auto"/>
+                  <w:jc w:val="both"/>
+                  <w:rPr>
+                    <w:rFonts w:ascii="Times New Roman" w:hAnsi="Times New Roman" w:cs="Times New Roman"/>
+                    <w:color w:val="000000"/>
+                    <w:lang w:val="nl-BE"/>
+                  </w:rPr>
+                </w:pPr>
+                <w:proofErr w:type="spellStart"/>
+                <w:r>
+                  <w:rPr>
+                    <w:rFonts w:ascii="Times New Roman" w:hAnsi="Times New Roman" w:cs="Times New Roman"/>
+                    <w:color w:val="000000"/>
+                    <w:lang w:val="nl-BE"/>
+                  </w:rPr>
+                  <w:t>Jayanti</w:t>
+                </w:r>
+                <w:proofErr w:type="spellEnd"/>
+                <w:r>
+                  <w:rPr>
+                    <w:rFonts w:ascii="Times New Roman" w:hAnsi="Times New Roman" w:cs="Times New Roman"/>
+                    <w:color w:val="000000"/>
+                    <w:lang w:val="nl-BE"/>
+                  </w:rPr>
+                  <w:t xml:space="preserve"> et al</w:t>
+                </w:r>
+                <w:r>
+                  <w:rPr>
+                    <w:rFonts w:ascii="Times New Roman" w:hAnsi="Times New Roman" w:cs="Times New Roman"/>
+                    <w:color w:val="000000"/>
+                    <w:lang w:val="nl-BE"/>
+                  </w:rPr>
+                  <w:t>.</w:t>
+                </w:r>
+                <w:r>
+                  <w:rPr>
+                    <w:rFonts w:ascii="Times New Roman" w:hAnsi="Times New Roman" w:cs="Times New Roman"/>
+                    <w:color w:val="000000"/>
+                    <w:lang w:val="nl-BE"/>
+                  </w:rPr>
+                  <w:t xml:space="preserve"> </w:t>
+                </w:r>
+                <w:r>
+                  <w:rPr>
+                    <w:rFonts w:ascii="Times New Roman" w:hAnsi="Times New Roman" w:cs="Times New Roman"/>
+                    <w:color w:val="000000"/>
+                    <w:lang w:val="nl-BE"/>
+                  </w:rPr>
+                  <w:t xml:space="preserve">(2018) </w:t>
+                </w:r>
+                <w:r>
+                  <w:rPr>
+                    <w:rFonts w:ascii="Times New Roman" w:hAnsi="Times New Roman" w:cs="Times New Roman"/>
+                    <w:color w:val="000000"/>
+                    <w:lang w:val="nl-BE"/>
+                  </w:rPr>
+                  <w:t>[3]</w:t>
+                </w:r>
+              </w:p>
+            </w:sdtContent>
+          </w:sdt>
+        </w:tc>
+        <w:tc>
+          <w:tcPr>
+            <w:tcW w:w="0" w:type="auto"/>
           </w:tcPr>
           <w:p>
             <w:pPr>
@@ -12585,77 +12784,58 @@
               <w:rPr>
                 <w:rFonts w:ascii="Times New Roman" w:hAnsi="Times New Roman" w:cs="Times New Roman"/>
               </w:rPr>
-              <w:t>Harahap</w:t>
+              <w:t>Sistem</w:t>
             </w:r>
             <w:proofErr w:type="spellEnd"/>
             <w:r>
               <w:rPr>
                 <w:rFonts w:ascii="Times New Roman" w:hAnsi="Times New Roman" w:cs="Times New Roman"/>
               </w:rPr>
-              <w:t xml:space="preserve"> et al. (2023) [3]</w:t>
-            </w:r>
-          </w:p>
-        </w:tc>
-        <w:tc>
-          <w:tcPr>
-            <w:tcW w:w="1179" w:type="dxa"/>
-          </w:tcPr>
-          <w:p>
-            <w:pPr>
-              <w:pStyle w:val="Compact"/>
-              <w:spacing w:line="276" w:lineRule="auto"/>
-              <w:jc w:val="both"/>
-              <w:rPr>
-                <w:rFonts w:ascii="Times New Roman" w:hAnsi="Times New Roman" w:cs="Times New Roman"/>
-              </w:rPr>
-            </w:pPr>
+              <w:t xml:space="preserve"> </w:t>
+            </w:r>
             <w:proofErr w:type="spellStart"/>
             <w:r>
               <w:rPr>
                 <w:rFonts w:ascii="Times New Roman" w:hAnsi="Times New Roman" w:cs="Times New Roman"/>
               </w:rPr>
-              <w:t>Sistem</w:t>
+              <w:t>Informasi</w:t>
             </w:r>
             <w:proofErr w:type="spellEnd"/>
             <w:r>
               <w:rPr>
                 <w:rFonts w:ascii="Times New Roman" w:hAnsi="Times New Roman" w:cs="Times New Roman"/>
               </w:rPr>
-              <w:t xml:space="preserve"> </w:t>
-            </w:r>
+              <w:t xml:space="preserve"> P</w:t>
+            </w:r>
+          </w:p>
+          <w:p>
+            <w:pPr>
+              <w:pStyle w:val="Compact"/>
+              <w:spacing w:line="276" w:lineRule="auto"/>
+              <w:jc w:val="both"/>
+              <w:rPr>
+                <w:rFonts w:ascii="Times New Roman" w:hAnsi="Times New Roman" w:cs="Times New Roman"/>
+              </w:rPr>
+            </w:pPr>
             <w:proofErr w:type="spellStart"/>
             <w:r>
               <w:rPr>
                 <w:rFonts w:ascii="Times New Roman" w:hAnsi="Times New Roman" w:cs="Times New Roman"/>
               </w:rPr>
-              <w:t>Informasi</w:t>
+              <w:t>enjualan</w:t>
             </w:r>
             <w:proofErr w:type="spellEnd"/>
             <w:r>
               <w:rPr>
                 <w:rFonts w:ascii="Times New Roman" w:hAnsi="Times New Roman" w:cs="Times New Roman"/>
               </w:rPr>
-              <w:t xml:space="preserve"> </w:t>
-            </w:r>
-            <w:proofErr w:type="spellStart"/>
-            <w:r>
-              <w:rPr>
-                <w:rFonts w:ascii="Times New Roman" w:hAnsi="Times New Roman" w:cs="Times New Roman"/>
-              </w:rPr>
-              <w:t>Penjualan</w:t>
-            </w:r>
-            <w:proofErr w:type="spellEnd"/>
-            <w:r>
-              <w:rPr>
-                <w:rFonts w:ascii="Times New Roman" w:hAnsi="Times New Roman" w:cs="Times New Roman"/>
-              </w:rPr>
               <w:t xml:space="preserve"> Gas LPG 3 Kg</w:t>
             </w:r>
           </w:p>
         </w:tc>
         <w:tc>
           <w:tcPr>
-            <w:tcW w:w="1853" w:type="dxa"/>
+            <w:tcW w:w="0" w:type="auto"/>
           </w:tcPr>
           <w:p>
             <w:pPr>
@@ -12676,7 +12856,7 @@
         </w:tc>
         <w:tc>
           <w:tcPr>
-            <w:tcW w:w="1179" w:type="dxa"/>
+            <w:tcW w:w="0" w:type="auto"/>
           </w:tcPr>
           <w:p>
             <w:pPr>
@@ -12729,7 +12909,7 @@
       <w:tr>
         <w:tc>
           <w:tcPr>
-            <w:tcW w:w="674" w:type="dxa"/>
+            <w:tcW w:w="0" w:type="auto"/>
           </w:tcPr>
           <w:p>
             <w:pPr>
@@ -12748,30 +12928,53 @@
             </w:r>
           </w:p>
         </w:tc>
-        <w:tc>
-          <w:tcPr>
-            <w:tcW w:w="3033" w:type="dxa"/>
-          </w:tcPr>
-          <w:p>
-            <w:pPr>
-              <w:pStyle w:val="Compact"/>
-              <w:spacing w:line="276" w:lineRule="auto"/>
-              <w:jc w:val="both"/>
-              <w:rPr>
-                <w:rFonts w:ascii="Times New Roman" w:hAnsi="Times New Roman" w:cs="Times New Roman"/>
-              </w:rPr>
-            </w:pPr>
-            <w:r>
-              <w:rPr>
-                <w:rFonts w:ascii="Times New Roman" w:hAnsi="Times New Roman" w:cs="Times New Roman"/>
-              </w:rPr>
-              <w:t>Kurniawan &amp; Saputra (2022) [4]</w:t>
-            </w:r>
-          </w:p>
-        </w:tc>
-        <w:tc>
-          <w:tcPr>
-            <w:tcW w:w="1179" w:type="dxa"/>
+        <w:sdt>
+          <w:sdtPr>
+            <w:rPr>
+              <w:rFonts w:ascii="Times New Roman" w:hAnsi="Times New Roman" w:cs="Times New Roman"/>
+              <w:color w:val="000000"/>
+            </w:rPr>
+            <w:tag w:val="MENDELEY_CITATION_v3_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"/>
+            <w:id w:val="60836033"/>
+            <w:placeholder>
+              <w:docPart w:val="DefaultPlaceholder_-1854013440"/>
+            </w:placeholder>
+          </w:sdtPr>
+          <w:sdtContent>
+            <w:tc>
+              <w:tcPr>
+                <w:tcW w:w="1106" w:type="dxa"/>
+              </w:tcPr>
+              <w:p>
+                <w:pPr>
+                  <w:pStyle w:val="Compact"/>
+                  <w:spacing w:line="276" w:lineRule="auto"/>
+                  <w:jc w:val="both"/>
+                  <w:rPr>
+                    <w:rFonts w:ascii="Times New Roman" w:hAnsi="Times New Roman" w:cs="Times New Roman"/>
+                  </w:rPr>
+                </w:pPr>
+                <w:r>
+                  <w:rPr>
+                    <w:rFonts w:ascii="Times New Roman" w:hAnsi="Times New Roman" w:cs="Times New Roman"/>
+                    <w:color w:val="000000"/>
+                  </w:rPr>
+                  <w:t xml:space="preserve">Dewi et al. (2023) </w:t>
+                </w:r>
+                <w:r>
+                  <w:rPr>
+                    <w:rFonts w:ascii="Times New Roman" w:hAnsi="Times New Roman" w:cs="Times New Roman"/>
+                    <w:color w:val="000000"/>
+                  </w:rPr>
+                  <w:t>[4]</w:t>
+                </w:r>
+              </w:p>
+            </w:tc>
+          </w:sdtContent>
+        </w:sdt>
+        <w:tc>
+          <w:tcPr>
+            <w:tcW w:w="0" w:type="auto"/>
           </w:tcPr>
           <w:p>
             <w:pPr>
@@ -12828,7 +13031,7 @@
         </w:tc>
         <w:tc>
           <w:tcPr>
-            <w:tcW w:w="1853" w:type="dxa"/>
+            <w:tcW w:w="0" w:type="auto"/>
           </w:tcPr>
           <w:p>
             <w:pPr>
@@ -12849,7 +13052,7 @@
         </w:tc>
         <w:tc>
           <w:tcPr>
-            <w:tcW w:w="1179" w:type="dxa"/>
+            <w:tcW w:w="0" w:type="auto"/>
           </w:tcPr>
           <w:p>
             <w:pPr>
@@ -12902,7 +13105,7 @@
       <w:tr>
         <w:tc>
           <w:tcPr>
-            <w:tcW w:w="674" w:type="dxa"/>
+            <w:tcW w:w="0" w:type="auto"/>
           </w:tcPr>
           <w:p>
             <w:pPr>
@@ -12921,30 +13124,62 @@
             </w:r>
           </w:p>
         </w:tc>
-        <w:tc>
-          <w:tcPr>
-            <w:tcW w:w="3033" w:type="dxa"/>
-          </w:tcPr>
-          <w:p>
-            <w:pPr>
-              <w:pStyle w:val="Compact"/>
-              <w:spacing w:line="276" w:lineRule="auto"/>
-              <w:jc w:val="both"/>
-              <w:rPr>
-                <w:rFonts w:ascii="Times New Roman" w:hAnsi="Times New Roman" w:cs="Times New Roman"/>
-              </w:rPr>
-            </w:pPr>
-            <w:r>
-              <w:rPr>
-                <w:rFonts w:ascii="Times New Roman" w:hAnsi="Times New Roman" w:cs="Times New Roman"/>
-              </w:rPr>
-              <w:t>Pratama &amp; Wijaya (2024) [5]</w:t>
-            </w:r>
-          </w:p>
-        </w:tc>
-        <w:tc>
-          <w:tcPr>
-            <w:tcW w:w="1179" w:type="dxa"/>
+        <w:sdt>
+          <w:sdtPr>
+            <w:rPr>
+              <w:rFonts w:ascii="Times New Roman" w:hAnsi="Times New Roman" w:cs="Times New Roman"/>
+              <w:color w:val="000000"/>
+            </w:rPr>
+            <w:tag w:val="MENDELEY_CITATION_v3_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"/>
+            <w:id w:val="1270273124"/>
+            <w:placeholder>
+              <w:docPart w:val="DefaultPlaceholder_-1854013440"/>
+            </w:placeholder>
+          </w:sdtPr>
+          <w:sdtContent>
+            <w:tc>
+              <w:tcPr>
+                <w:tcW w:w="1106" w:type="dxa"/>
+              </w:tcPr>
+              <w:p>
+                <w:pPr>
+                  <w:pStyle w:val="Compact"/>
+                  <w:spacing w:line="276" w:lineRule="auto"/>
+                  <w:jc w:val="both"/>
+                  <w:rPr>
+                    <w:rFonts w:ascii="Times New Roman" w:hAnsi="Times New Roman" w:cs="Times New Roman"/>
+                  </w:rPr>
+                </w:pPr>
+                <w:proofErr w:type="spellStart"/>
+                <w:r>
+                  <w:rPr>
+                    <w:rFonts w:ascii="Times New Roman" w:hAnsi="Times New Roman" w:cs="Times New Roman"/>
+                    <w:color w:val="000000"/>
+                  </w:rPr>
+                  <w:t>Budianto</w:t>
+                </w:r>
+                <w:proofErr w:type="spellEnd"/>
+                <w:r>
+                  <w:rPr>
+                    <w:rFonts w:ascii="Times New Roman" w:hAnsi="Times New Roman" w:cs="Times New Roman"/>
+                    <w:color w:val="000000"/>
+                  </w:rPr>
+                  <w:t xml:space="preserve"> et al. (2025) </w:t>
+                </w:r>
+                <w:r>
+                  <w:rPr>
+                    <w:rFonts w:ascii="Times New Roman" w:hAnsi="Times New Roman" w:cs="Times New Roman"/>
+                    <w:color w:val="000000"/>
+                  </w:rPr>
+                  <w:t>[5]</w:t>
+                </w:r>
+              </w:p>
+            </w:tc>
+          </w:sdtContent>
+        </w:sdt>
+        <w:tc>
+          <w:tcPr>
+            <w:tcW w:w="0" w:type="auto"/>
           </w:tcPr>
           <w:p>
             <w:pPr>
@@ -12987,7 +13222,7 @@
         </w:tc>
         <w:tc>
           <w:tcPr>
-            <w:tcW w:w="1853" w:type="dxa"/>
+            <w:tcW w:w="0" w:type="auto"/>
           </w:tcPr>
           <w:p>
             <w:pPr>
@@ -13008,7 +13243,7 @@
         </w:tc>
         <w:tc>
           <w:tcPr>
-            <w:tcW w:w="1179" w:type="dxa"/>
+            <w:tcW w:w="0" w:type="auto"/>
           </w:tcPr>
           <w:p>
             <w:pPr>
@@ -13039,7 +13274,7 @@
       <w:tr>
         <w:tc>
           <w:tcPr>
-            <w:tcW w:w="674" w:type="dxa"/>
+            <w:tcW w:w="0" w:type="auto"/>
           </w:tcPr>
           <w:p>
             <w:pPr>
@@ -13060,28 +13295,51 @@
         </w:tc>
         <w:tc>
           <w:tcPr>
-            <w:tcW w:w="3033" w:type="dxa"/>
-          </w:tcPr>
-          <w:p>
-            <w:pPr>
-              <w:pStyle w:val="Compact"/>
-              <w:spacing w:line="276" w:lineRule="auto"/>
-              <w:jc w:val="both"/>
-              <w:rPr>
-                <w:rFonts w:ascii="Times New Roman" w:hAnsi="Times New Roman" w:cs="Times New Roman"/>
-              </w:rPr>
-            </w:pPr>
-            <w:r>
-              <w:rPr>
-                <w:rFonts w:ascii="Times New Roman" w:hAnsi="Times New Roman" w:cs="Times New Roman"/>
-              </w:rPr>
-              <w:t>Rahmawati et al. (2022) [11]</w:t>
-            </w:r>
-          </w:p>
-        </w:tc>
-        <w:tc>
-          <w:tcPr>
-            <w:tcW w:w="1179" w:type="dxa"/>
+            <w:tcW w:w="1106" w:type="dxa"/>
+          </w:tcPr>
+          <w:sdt>
+            <w:sdtPr>
+              <w:rPr>
+                <w:rFonts w:ascii="Times New Roman" w:hAnsi="Times New Roman" w:cs="Times New Roman"/>
+                <w:color w:val="000000"/>
+              </w:rPr>
+              <w:tag w:val="MENDELEY_CITATION_v3_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"/>
+              <w:id w:val="-499960756"/>
+              <w:placeholder>
+                <w:docPart w:val="DefaultPlaceholder_-1854013440"/>
+              </w:placeholder>
+            </w:sdtPr>
+            <w:sdtContent>
+              <w:p>
+                <w:pPr>
+                  <w:pStyle w:val="Compact"/>
+                  <w:spacing w:line="276" w:lineRule="auto"/>
+                  <w:jc w:val="both"/>
+                  <w:rPr>
+                    <w:rFonts w:ascii="Times New Roman" w:hAnsi="Times New Roman" w:cs="Times New Roman"/>
+                  </w:rPr>
+                </w:pPr>
+                <w:r>
+                  <w:rPr>
+                    <w:rFonts w:ascii="Times New Roman" w:hAnsi="Times New Roman" w:cs="Times New Roman"/>
+                    <w:color w:val="000000"/>
+                  </w:rPr>
+                  <w:t xml:space="preserve">Tjahjo Utomo et al. (2022) </w:t>
+                </w:r>
+                <w:r>
+                  <w:rPr>
+                    <w:rFonts w:ascii="Times New Roman" w:hAnsi="Times New Roman" w:cs="Times New Roman"/>
+                    <w:color w:val="000000"/>
+                  </w:rPr>
+                  <w:t>[11]</w:t>
+                </w:r>
+              </w:p>
+            </w:sdtContent>
+          </w:sdt>
+        </w:tc>
+        <w:tc>
+          <w:tcPr>
+            <w:tcW w:w="0" w:type="auto"/>
           </w:tcPr>
           <w:p>
             <w:pPr>
@@ -13110,19 +13368,13 @@
               <w:rPr>
                 <w:rFonts w:ascii="Times New Roman" w:hAnsi="Times New Roman" w:cs="Times New Roman"/>
               </w:rPr>
-              <w:t xml:space="preserve"> Gas </w:t>
-            </w:r>
-            <w:r>
-              <w:rPr>
-                <w:rFonts w:ascii="Times New Roman" w:hAnsi="Times New Roman" w:cs="Times New Roman"/>
-              </w:rPr>
-              <w:t>LPG 3Kg</w:t>
-            </w:r>
-          </w:p>
-        </w:tc>
-        <w:tc>
-          <w:tcPr>
-            <w:tcW w:w="1853" w:type="dxa"/>
+              <w:t xml:space="preserve"> Gas LPG 3Kg</w:t>
+            </w:r>
+          </w:p>
+        </w:tc>
+        <w:tc>
+          <w:tcPr>
+            <w:tcW w:w="0" w:type="auto"/>
           </w:tcPr>
           <w:p>
             <w:pPr>
@@ -13143,7 +13395,7 @@
         </w:tc>
         <w:tc>
           <w:tcPr>
-            <w:tcW w:w="1179" w:type="dxa"/>
+            <w:tcW w:w="0" w:type="auto"/>
           </w:tcPr>
           <w:p>
             <w:pPr>
@@ -13182,7 +13434,7 @@
       <w:tr>
         <w:tc>
           <w:tcPr>
-            <w:tcW w:w="674" w:type="dxa"/>
+            <w:tcW w:w="0" w:type="auto"/>
           </w:tcPr>
           <w:p>
             <w:pPr>
@@ -13203,7 +13455,7 @@
         </w:tc>
         <w:tc>
           <w:tcPr>
-            <w:tcW w:w="3033" w:type="dxa"/>
+            <w:tcW w:w="1106" w:type="dxa"/>
           </w:tcPr>
           <w:p>
             <w:pPr>
@@ -13224,7 +13476,7 @@
         </w:tc>
         <w:tc>
           <w:tcPr>
-            <w:tcW w:w="1179" w:type="dxa"/>
+            <w:tcW w:w="0" w:type="auto"/>
           </w:tcPr>
           <w:p>
             <w:pPr>
@@ -13281,7 +13533,7 @@
         </w:tc>
         <w:tc>
           <w:tcPr>
-            <w:tcW w:w="1853" w:type="dxa"/>
+            <w:tcW w:w="0" w:type="auto"/>
           </w:tcPr>
           <w:p>
             <w:pPr>
@@ -13302,7 +13554,7 @@
         </w:tc>
         <w:tc>
           <w:tcPr>
-            <w:tcW w:w="1179" w:type="dxa"/>
+            <w:tcW w:w="0" w:type="auto"/>
           </w:tcPr>
           <w:p>
             <w:pPr>
@@ -13347,7 +13599,7 @@
       <w:tr>
         <w:tc>
           <w:tcPr>
-            <w:tcW w:w="674" w:type="dxa"/>
+            <w:tcW w:w="0" w:type="auto"/>
           </w:tcPr>
           <w:p>
             <w:pPr>
@@ -13368,7 +13620,7 @@
         </w:tc>
         <w:tc>
           <w:tcPr>
-            <w:tcW w:w="3033" w:type="dxa"/>
+            <w:tcW w:w="1106" w:type="dxa"/>
           </w:tcPr>
           <w:p>
             <w:pPr>
@@ -13389,7 +13641,7 @@
         </w:tc>
         <w:tc>
           <w:tcPr>
-            <w:tcW w:w="1179" w:type="dxa"/>
+            <w:tcW w:w="0" w:type="auto"/>
           </w:tcPr>
           <w:p>
             <w:pPr>
@@ -13438,7 +13690,7 @@
         </w:tc>
         <w:tc>
           <w:tcPr>
-            <w:tcW w:w="1853" w:type="dxa"/>
+            <w:tcW w:w="0" w:type="auto"/>
           </w:tcPr>
           <w:p>
             <w:pPr>
@@ -13459,7 +13711,7 @@
         </w:tc>
         <w:tc>
           <w:tcPr>
-            <w:tcW w:w="1179" w:type="dxa"/>
+            <w:tcW w:w="0" w:type="auto"/>
           </w:tcPr>
           <w:p>
             <w:pPr>
@@ -14167,7 +14419,6 @@
               <w:rPr>
                 <w:rFonts w:ascii="Times New Roman" w:hAnsi="Times New Roman" w:cs="Times New Roman"/>
               </w:rPr>
-              <w:lastRenderedPageBreak/>
               <w:t>Separate Database</w:t>
             </w:r>
           </w:p>
@@ -15030,7 +15281,14 @@
         <w:rPr>
           <w:rFonts w:ascii="Times New Roman" w:hAnsi="Times New Roman" w:cs="Times New Roman"/>
         </w:rPr>
-        <w:t xml:space="preserve"> dependency injection - TypeScript native support - Integrasi </w:t>
+        <w:t xml:space="preserve"> dependency injection - TypeScript native </w:t>
+      </w:r>
+      <w:r>
+        <w:rPr>
+          <w:rFonts w:ascii="Times New Roman" w:hAnsi="Times New Roman" w:cs="Times New Roman"/>
+        </w:rPr>
+        <w:lastRenderedPageBreak/>
+        <w:t xml:space="preserve">support - Integrasi </w:t>
       </w:r>
       <w:proofErr w:type="spellStart"/>
       <w:r>
@@ -15234,13 +15492,7 @@
         <w:rPr>
           <w:rFonts w:ascii="Times New Roman" w:hAnsi="Times New Roman" w:cs="Times New Roman"/>
         </w:rPr>
-        <w:t xml:space="preserve"> data </w:t>
-      </w:r>
-      <w:r>
-        <w:rPr>
-          <w:rFonts w:ascii="Times New Roman" w:hAnsi="Times New Roman" w:cs="Times New Roman"/>
-        </w:rPr>
-        <w:t xml:space="preserve">semi-structured - Mature dan </w:t>
+        <w:t xml:space="preserve"> data semi-structured - Mature dan </w:t>
       </w:r>
       <w:proofErr w:type="spellStart"/>
       <w:r>
@@ -16376,7 +16628,7 @@
           <w:rFonts w:ascii="Times New Roman" w:hAnsi="Times New Roman" w:cs="Times New Roman"/>
         </w:rPr>
         <w:pict w14:anchorId="4DE82149">
-          <v:rect id="_x0000_i1029" style="width:0;height:1.5pt" o:hralign="center" o:hrstd="t" o:hr="t"/>
+          <v:rect id="_x0000_i2426" style="width:0;height:1.5pt" o:hralign="center" o:hrstd="t" o:hr="t"/>
         </w:pict>
       </w:r>
     </w:p>
@@ -16398,7 +16650,6 @@
           <w:rFonts w:ascii="Times New Roman" w:hAnsi="Times New Roman" w:cs="Times New Roman"/>
           <w:color w:val="auto"/>
         </w:rPr>
-        <w:lastRenderedPageBreak/>
         <w:t>3. METODOLOGI PENELITIAN</w:t>
       </w:r>
     </w:p>
@@ -17349,6 +17600,7 @@
         <w:rPr>
           <w:rFonts w:ascii="Times New Roman" w:hAnsi="Times New Roman" w:cs="Times New Roman"/>
         </w:rPr>
+        <w:lastRenderedPageBreak/>
         <w:t>teknologi</w:t>
       </w:r>
       <w:proofErr w:type="spellEnd"/>
@@ -19210,15 +19462,7 @@
           <w:rStyle w:val="VerbatimChar"/>
           <w:rFonts w:ascii="Times New Roman" w:hAnsi="Times New Roman" w:cs="Times New Roman"/>
         </w:rPr>
-        <w:t>Dokumentas</w:t>
-      </w:r>
-      <w:r>
-        <w:rPr>
-          <w:rStyle w:val="VerbatimChar"/>
-          <w:rFonts w:ascii="Times New Roman" w:hAnsi="Times New Roman" w:cs="Times New Roman"/>
-        </w:rPr>
-        <w:lastRenderedPageBreak/>
-        <w:t>i</w:t>
+        <w:t>Dokumentasi</w:t>
       </w:r>
       <w:proofErr w:type="spellEnd"/>
       <w:r>
@@ -20454,7 +20698,14 @@
         <w:rPr>
           <w:rFonts w:ascii="Times New Roman" w:hAnsi="Times New Roman" w:cs="Times New Roman"/>
         </w:rPr>
-        <w:t xml:space="preserve"> test case 3. </w:t>
+        <w:t xml:space="preserve"> </w:t>
+      </w:r>
+      <w:r>
+        <w:rPr>
+          <w:rFonts w:ascii="Times New Roman" w:hAnsi="Times New Roman" w:cs="Times New Roman"/>
+        </w:rPr>
+        <w:lastRenderedPageBreak/>
+        <w:t xml:space="preserve">test case 3. </w:t>
       </w:r>
       <w:proofErr w:type="spellStart"/>
       <w:r>
@@ -20540,7 +20791,7 @@
           <w:rFonts w:ascii="Times New Roman" w:hAnsi="Times New Roman" w:cs="Times New Roman"/>
         </w:rPr>
         <w:pict w14:anchorId="5D51CAF4">
-          <v:rect id="_x0000_i1030" style="width:0;height:1.5pt" o:hralign="center" o:hrstd="t" o:hr="t"/>
+          <v:rect id="_x0000_i2427" style="width:0;height:1.5pt" o:hralign="center" o:hrstd="t" o:hr="t"/>
         </w:pict>
       </w:r>
     </w:p>
@@ -21842,7 +22093,6 @@
           <w:rFonts w:ascii="Times New Roman" w:hAnsi="Times New Roman" w:cs="Times New Roman"/>
           <w:color w:val="auto"/>
         </w:rPr>
-        <w:lastRenderedPageBreak/>
         <w:t xml:space="preserve">4.3 </w:t>
       </w:r>
       <w:proofErr w:type="spellStart"/>
@@ -23233,6 +23483,7 @@
               <w:rPr>
                 <w:rFonts w:ascii="Times New Roman" w:hAnsi="Times New Roman" w:cs="Times New Roman"/>
               </w:rPr>
+              <w:lastRenderedPageBreak/>
               <w:t>UC11</w:t>
             </w:r>
           </w:p>
@@ -23335,13 +23586,7 @@
               <w:rPr>
                 <w:rFonts w:ascii="Times New Roman" w:hAnsi="Times New Roman" w:cs="Times New Roman"/>
               </w:rPr>
-              <w:t>UC</w:t>
-            </w:r>
-            <w:r>
-              <w:rPr>
-                <w:rFonts w:ascii="Times New Roman" w:hAnsi="Times New Roman" w:cs="Times New Roman"/>
-              </w:rPr>
-              <w:t>12</w:t>
+              <w:t>UC12</w:t>
             </w:r>
           </w:p>
         </w:tc>
@@ -24666,7 +24911,6 @@
           <w:rFonts w:ascii="Times New Roman" w:hAnsi="Times New Roman" w:cs="Times New Roman"/>
           <w:color w:val="auto"/>
         </w:rPr>
-        <w:lastRenderedPageBreak/>
         <w:t>4.3.4 Sequence Diagram - Login</w:t>
       </w:r>
     </w:p>
@@ -25511,6 +25755,7 @@
           <w:rFonts w:ascii="Times New Roman" w:hAnsi="Times New Roman" w:cs="Times New Roman"/>
           <w:color w:val="auto"/>
         </w:rPr>
+        <w:lastRenderedPageBreak/>
         <w:t xml:space="preserve">4.3.7 State Machine Diagram - Status </w:t>
       </w:r>
       <w:proofErr w:type="spellStart"/>
@@ -26321,7 +26566,6 @@
         <w:rPr>
           <w:rFonts w:ascii="Times New Roman" w:hAnsi="Times New Roman" w:cs="Times New Roman"/>
         </w:rPr>
-        <w:lastRenderedPageBreak/>
         <w:t xml:space="preserve">(Railway) - </w:t>
       </w:r>
       <w:r>
@@ -27024,6 +27268,7 @@
               <w:rPr>
                 <w:rFonts w:ascii="Times New Roman" w:hAnsi="Times New Roman" w:cs="Times New Roman"/>
               </w:rPr>
+              <w:lastRenderedPageBreak/>
               <w:t>No</w:t>
             </w:r>
           </w:p>
@@ -27942,7 +28187,6 @@
               <w:rPr>
                 <w:rFonts w:ascii="Times New Roman" w:hAnsi="Times New Roman" w:cs="Times New Roman"/>
               </w:rPr>
-              <w:lastRenderedPageBreak/>
               <w:t>6</w:t>
             </w:r>
           </w:p>
@@ -29369,6 +29613,7 @@
               <w:rPr>
                 <w:rFonts w:ascii="Times New Roman" w:hAnsi="Times New Roman" w:cs="Times New Roman"/>
               </w:rPr>
+              <w:lastRenderedPageBreak/>
               <w:t>n</w:t>
             </w:r>
             <w:proofErr w:type="spellEnd"/>
@@ -29391,6 +29636,7 @@
               <w:rPr>
                 <w:rFonts w:ascii="Times New Roman" w:hAnsi="Times New Roman" w:cs="Times New Roman"/>
               </w:rPr>
+              <w:lastRenderedPageBreak/>
               <w:t>5</w:t>
             </w:r>
           </w:p>
@@ -30578,7 +30824,7 @@
           <w:rFonts w:ascii="Times New Roman" w:hAnsi="Times New Roman" w:cs="Times New Roman"/>
         </w:rPr>
         <w:pict w14:anchorId="25E3DFE3">
-          <v:rect id="_x0000_i1031" style="width:0;height:1.5pt" o:hralign="center" o:hrstd="t" o:hr="t"/>
+          <v:rect id="_x0000_i2428" style="width:0;height:1.5pt" o:hralign="center" o:hrstd="t" o:hr="t"/>
         </w:pict>
       </w:r>
     </w:p>
@@ -30700,7 +30946,6 @@
         <w:rPr>
           <w:rFonts w:ascii="Times New Roman" w:hAnsi="Times New Roman" w:cs="Times New Roman"/>
         </w:rPr>
-        <w:lastRenderedPageBreak/>
         <w:t>Sistem</w:t>
       </w:r>
       <w:proofErr w:type="spellEnd"/>
@@ -31292,7 +31537,7 @@
           <w:rFonts w:ascii="Times New Roman" w:hAnsi="Times New Roman" w:cs="Times New Roman"/>
         </w:rPr>
         <w:pict w14:anchorId="3210DADC">
-          <v:rect id="_x0000_i1032" style="width:0;height:1.5pt" o:hralign="center" o:hrstd="t" o:hr="t"/>
+          <v:rect id="_x0000_i2429" style="width:0;height:1.5pt" o:hralign="center" o:hrstd="t" o:hr="t"/>
         </w:pict>
       </w:r>
     </w:p>
@@ -31470,6 +31715,7 @@
         <w:rPr>
           <w:rFonts w:ascii="Times New Roman" w:hAnsi="Times New Roman" w:cs="Times New Roman"/>
         </w:rPr>
+        <w:lastRenderedPageBreak/>
         <w:t xml:space="preserve">[3] </w:t>
       </w:r>
       <w:r>
@@ -32194,7 +32440,6 @@
           <w:i/>
           <w:iCs/>
         </w:rPr>
-        <w:lastRenderedPageBreak/>
         <w:t>the Digital Firm</w:t>
       </w:r>
       <w:r>
@@ -32701,6 +32946,7 @@
         <w:rPr>
           <w:rFonts w:ascii="Times New Roman" w:hAnsi="Times New Roman" w:cs="Times New Roman"/>
         </w:rPr>
+        <w:lastRenderedPageBreak/>
         <w:t>[22] World LPG Association, “Statistical Review of Global LPG 2023,” Singapore Maritime Foundation, 2023.</w:t>
       </w:r>
     </w:p>
@@ -32841,7 +33087,7 @@
           <w:rFonts w:ascii="Times New Roman" w:hAnsi="Times New Roman" w:cs="Times New Roman"/>
         </w:rPr>
         <w:pict w14:anchorId="4BA90A21">
-          <v:rect id="_x0000_i1033" style="width:0;height:1.5pt" o:hralign="center" o:hrstd="t" o:hr="t"/>
+          <v:rect id="_x0000_i2430" style="width:0;height:1.5pt" o:hralign="center" o:hrstd="t" o:hr="t"/>
         </w:pict>
       </w:r>
     </w:p>
@@ -33278,7 +33524,7 @@
           <w:rFonts w:ascii="Times New Roman" w:hAnsi="Times New Roman" w:cs="Times New Roman"/>
         </w:rPr>
         <w:pict w14:anchorId="2EF67685">
-          <v:rect id="_x0000_i1034" style="width:0;height:1.5pt" o:hralign="center" o:hrstd="t" o:hr="t"/>
+          <v:rect id="_x0000_i2431" style="width:0;height:1.5pt" o:hralign="center" o:hrstd="t" o:hr="t"/>
         </w:pict>
       </w:r>
     </w:p>
@@ -33297,7 +33543,6 @@
           <w:i/>
           <w:iCs/>
         </w:rPr>
-        <w:lastRenderedPageBreak/>
         <w:t xml:space="preserve">Artikel </w:t>
       </w:r>
       <w:proofErr w:type="spellStart"/>
@@ -33460,7 +33705,7 @@
           <w:rFonts w:ascii="Times New Roman" w:hAnsi="Times New Roman" w:cs="Times New Roman"/>
         </w:rPr>
         <w:pict w14:anchorId="402DA0B0">
-          <v:rect id="_x0000_i1035" style="width:0;height:1.5pt" o:hralign="center" o:hrstd="t" o:hr="t"/>
+          <v:rect id="_x0000_i2432" style="width:0;height:1.5pt" o:hralign="center" o:hrstd="t" o:hr="t"/>
         </w:pict>
       </w:r>
     </w:p>
@@ -34585,6 +34830,7 @@
                 <w:b/>
                 <w:bCs/>
               </w:rPr>
+              <w:lastRenderedPageBreak/>
               <w:t>(Order)</w:t>
             </w:r>
           </w:p>
@@ -34606,7 +34852,15 @@
               <w:rPr>
                 <w:rFonts w:ascii="Times New Roman" w:hAnsi="Times New Roman" w:cs="Times New Roman"/>
               </w:rPr>
-              <w:t>Bab 4.3.7</w:t>
+              <w:lastRenderedPageBreak/>
+              <w:t xml:space="preserve">Bab </w:t>
+            </w:r>
+            <w:r>
+              <w:rPr>
+                <w:rFonts w:ascii="Times New Roman" w:hAnsi="Times New Roman" w:cs="Times New Roman"/>
+              </w:rPr>
+              <w:lastRenderedPageBreak/>
+              <w:t>4.3.7</w:t>
             </w:r>
           </w:p>
         </w:tc>
@@ -34629,6 +34883,7 @@
               <w:rPr>
                 <w:rFonts w:ascii="Times New Roman" w:hAnsi="Times New Roman" w:cs="Times New Roman"/>
               </w:rPr>
+              <w:lastRenderedPageBreak/>
               <w:t>11</w:t>
             </w:r>
           </w:p>
@@ -35108,9 +35363,21 @@
     </w:p>
     <w:p>
       <w:pPr>
-        <w:pStyle w:val="BodyText"/>
-        <w:spacing w:line="276" w:lineRule="auto"/>
-        <w:jc w:val="both"/>
+        <w:rPr>
+          <w:rFonts w:ascii="Times New Roman" w:hAnsi="Times New Roman" w:cs="Times New Roman"/>
+          <w:lang w:val="nl-BE"/>
+        </w:rPr>
+      </w:pPr>
+      <w:r>
+        <w:rPr>
+          <w:rFonts w:ascii="Times New Roman" w:hAnsi="Times New Roman" w:cs="Times New Roman"/>
+          <w:lang w:val="nl-BE"/>
+        </w:rPr>
+        <w:br w:type="page"/>
+      </w:r>
+    </w:p>
+    <w:p>
+      <w:pPr>
         <w:rPr>
           <w:rFonts w:ascii="Times New Roman" w:hAnsi="Times New Roman" w:cs="Times New Roman"/>
           <w:lang w:val="nl-BE"/>
@@ -37009,8 +37276,8 @@
   <w:rsids>
     <w:rsidRoot w:val="00ED7FE3"/>
     <w:rsid w:val="00043BE9"/>
+    <w:rsid w:val="00642A13"/>
     <w:rsid w:val="007B3E91"/>
-    <w:rsid w:val="00921812"/>
     <w:rsid w:val="00A84CC8"/>
     <w:rsid w:val="00A92889"/>
     <w:rsid w:val="00ED7FE3"/>
@@ -37467,10 +37734,14 @@
   <w:style w:type="character" w:styleId="PlaceholderText">
     <w:name w:val="Placeholder Text"/>
     <w:basedOn w:val="DefaultParagraphFont"/>
-    <w:rsid w:val="00ED7FE3"/>
+    <w:rsid w:val="00043BE9"/>
     <w:rPr>
       <w:color w:val="666666"/>
     </w:rPr>
+  </w:style>
+  <w:style w:type="paragraph" w:customStyle="1" w:styleId="D912CD4A4C124F2B9BB2E276A0B93A63">
+    <w:name w:val="D912CD4A4C124F2B9BB2E276A0B93A63"/>
+    <w:rsid w:val="00043BE9"/>
   </w:style>
 </w:styles>
 </file>
@@ -37779,7 +38050,7 @@
 
 <file path=word/webextensions/taskpanes.xml><?xml version="1.0" encoding="utf-8"?>
 <wetp:taskpanes xmlns:wetp="http://schemas.microsoft.com/office/webextensions/taskpanes/2010/11">
-  <wetp:taskpane dockstate="right" visibility="0" width="438" row="2">
+  <wetp:taskpane dockstate="right" visibility="0" width="528" row="2">
     <wetp:webextensionref xmlns:r="http://schemas.openxmlformats.org/officeDocument/2006/relationships" r:id="rId1"/>
   </wetp:taskpane>
 </wetp:taskpanes>
@@ -37793,8 +38064,8 @@
   </we:alternateReferences>
   <we:properties>
     <we:property name="MENDELEY_BIBLIOGRAPHY_IS_DIRTY" value="true"/>
-    <we:property name="MENDELEY_BIBLIOGRAPHY_LAST_MODIFIED" value="1766748484812"/>
-    <we:property name="MENDELEY_CITATIONS" value="[{&quot;citationID&quot;:&quot;MENDELEY_CITATION_1cba8bf4-8057-460e-9347-1da179afcc54&quot;,&quot;properties&quot;:{&quot;noteIndex&quot;:0},&quot;isEdited&quot;:false,&quot;manualOverride&quot;:{&quot;isManuallyOverridden&quot;:false,&quot;citeprocText&quot;:&quot;[1]&quot;,&quot;manualOverrideText&quot;:&quot;&quot;},&quot;citationTag&quot;:&quot;MENDELEY_CITATION_v3_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&quot;,&quot;citationItems&quot;:[{&quot;id&quot;:&quot;db5f0a69-11e1-31bd-a007-dcb100cad7c3&quot;,&quot;itemData&quot;:{&quot;type&quot;:&quot;webpage&quot;,&quot;id&quot;:&quot;db5f0a69-11e1-31bd-a007-dcb100cad7c3&quot;,&quot;title&quot;:&quot;Penyaluran LPG 3 Kg Tembus 8,2 Juta Ton pada 2024&quot;,&quot;author&quot;:[{&quot;family&quot;:&quot;Pertamina&quot;,&quot;given&quot;:&quot;&quot;,&quot;parse-names&quot;:false,&quot;dropping-particle&quot;:&quot;&quot;,&quot;non-dropping-particle&quot;:&quot;&quot;}],&quot;container-title&quot;:&quot;Kontan&quot;,&quot;accessed&quot;:{&quot;date-parts&quot;:[[2025,12,26]]},&quot;URL&quot;:&quot;https://industri.kontan.co.id/news/pertamina-penyaluran-lpg-3-kg-tembus-82-juta-ton-pada-2024&quot;,&quot;issued&quot;:{&quot;date-parts&quot;:[[2025,6]]},&quot;language&quot;:&quot;Indonesia&quot;,&quot;container-title-short&quot;:&quot;&quot;},&quot;isTemporary&quot;:false,&quot;suppress-author&quot;:false,&quot;composite&quot;:false,&quot;author-only&quot;:false}]},{&quot;citationID&quot;:&quot;MENDELEY_CITATION_4bafd109-fca3-4569-8c20-2e0692c3ab9f&quot;,&quot;properties&quot;:{&quot;noteIndex&quot;:0},&quot;isEdited&quot;:false,&quot;manualOverride&quot;:{&quot;isManuallyOverridden&quot;:false,&quot;citeprocText&quot;:&quot;[2]&quot;,&quot;manualOverrideText&quot;:&quot;&quot;},&quot;citationTag&quot;:&quot;MENDELEY_CITATION_v3_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&quot;,&quot;citationItems&quot;:[{&quot;id&quot;:&quot;44ff0d65-16cb-3025-af63-48883f162e85&quot;,&quot;itemData&quot;:{&quot;type&quot;:&quot;webpage&quot;,&quot;id&quot;:&quot;44ff0d65-16cb-3025-af63-48883f162e85&quot;,&quot;title&quot;:&quot;Pedoman Distribusi LPG Tabung di Indonesia&quot;,&quot;author&quot;:[{&quot;family&quot;:&quot;BPH Migas&quot;,&quot;given&quot;:&quot;&quot;,&quot;parse-names&quot;:false,&quot;dropping-particle&quot;:&quot;&quot;,&quot;non-dropping-particle&quot;:&quot;&quot;}],&quot;accessed&quot;:{&quot;date-parts&quot;:[[2025,12,26]]},&quot;URL&quot;:&quot;https://migas.esdm.go.id/post/menteri-esdm-tetapkan-kepmen-esdm-tentang-petunjuk-teknis-pendistribusian-isi-ulang-lpg-tertentu-tepat-sasaran&quot;,&quot;issued&quot;:{&quot;date-parts&quot;:[[2024]]}},&quot;isTemporary&quot;:false,&quot;suppress-author&quot;:false,&quot;composite&quot;:false,&quot;author-only&quot;:false}]},{&quot;citationID&quot;:&quot;MENDELEY_CITATION_e7d43d1a-8a36-45fd-9239-0a5a660f2ff1&quot;,&quot;properties&quot;:{&quot;noteIndex&quot;:0},&quot;isEdited&quot;:false,&quot;manualOverride&quot;:{&quot;isManuallyOverridden&quot;:false,&quot;citeprocText&quot;:&quot;[3]&quot;,&quot;manualOverrideText&quot;:&quot;&quot;},&quot;citationTag&quot;:&quot;MENDELEY_CITATION_v3_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&quot;,&quot;citationItems&quot;:[{&quot;id&quot;:&quot;5d1bd1ba-82f8-36e2-8457-cbdc8da3427b&quot;,&quot;itemData&quot;:{&quot;type&quot;:&quot;article-journal&quot;,&quot;id&quot;:&quot;5d1bd1ba-82f8-36e2-8457-cbdc8da3427b&quot;,&quot;title&quot;:&quot;Perancangan Sistem Informasi Manajemen Distribusi Gas Elpiji Berbasis Web pada PT. Mita Kalbar Pontianak&quot;,&quot;author&quot;:[{&quot;family&quot;:&quot;Jayanti&quot;,&quot;given&quot;:&quot;Wanty Eka&quot;,&quot;parse-names&quot;:false,&quot;dropping-particle&quot;:&quot;&quot;,&quot;non-dropping-particle&quot;:&quot;&quot;},{&quot;family&quot;:&quot;Meilinda&quot;,&quot;given&quot;:&quot;Eva&quot;,&quot;parse-names&quot;:false,&quot;dropping-particle&quot;:&quot;&quot;,&quot;non-dropping-particle&quot;:&quot;&quot;},{&quot;family&quot;:&quot;Desi&quot;,&quot;given&quot;:&quot;Desi&quot;,&quot;parse-names&quot;:false,&quot;dropping-particle&quot;:&quot;&quot;,&quot;non-dropping-particle&quot;:&quot;&quot;}],&quot;container-title&quot;:&quot;Jurnal Khatulistiwa Informatika&quot;,&quot;issued&quot;:{&quot;date-parts&quot;:[[2018]]},&quot;abstract&quot;:&quot;Penelitian ini mengenai perancangan sistem informasi manajemen distribusi gas elpiji berbasis web pada PT.Mita Kalbar Pontianak. Pada PT tersebut masih menggunakan sistem pencatatan dan Microsoft excel sebagaimedia penyimpanan data penyaluran serta menggunakan sistem tertulis untuk pembuatan laporanpendapatan setiap harinya. Sistem ini dirancang dengan bahasa pemograman hyper text preprocessor (PHP)dan hyper text markup language (HTML) sebagai web editor. MySQL sebagai basis data dan Xampp sebagai webserver. Metode yang digunakan pada pengembangan perangkat lunak ini menggunakan model waterfall atauyang sering disebut metode air terjun dan teknik pengumpulan data yang digunakan yaitu pengamatanlangsung (observasi), Wawancara (Interview) serta Studi Pustaka. Dengan adanya rancangan sistem inidiharapkan dapat digunakan untuk membangun sistem informasi sebagai media penyimpanan datadistribusi dan laporan secara terkomputerisasi serta digunakan untuk membangun sistem informasi dalamupaya mengatur dan mengawasi penyaluran gas elpiji kepada konsumen.&quot;,&quot;issue&quot;:&quot;2&quot;,&quot;volume&quot;:&quot;6&quot;,&quot;container-title-short&quot;:&quot;&quot;},&quot;isTemporary&quot;:false,&quot;suppress-author&quot;:false,&quot;composite&quot;:false,&quot;author-only&quot;:false}]},{&quot;citationID&quot;:&quot;MENDELEY_CITATION_acbffb0a-3229-4bfa-ba24-4df22a145339&quot;,&quot;properties&quot;:{&quot;noteIndex&quot;:0},&quot;isEdited&quot;:false,&quot;manualOverride&quot;:{&quot;isManuallyOverridden&quot;:false,&quot;citeprocText&quot;:&quot;[4]&quot;,&quot;manualOverrideText&quot;:&quot;&quot;},&quot;citationTag&quot;:&quot;MENDELEY_CITATION_v3_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&quot;,&quot;citationItems&quot;:[{&quot;id&quot;:&quot;d4fccd83-9f89-3bda-af40-ca648ecc2094&quot;,&quot;itemData&quot;:{&quot;type&quot;:&quot;report&quot;,&quot;id&quot;:&quot;d4fccd83-9f89-3bda-af40-ca648ecc2094&quot;,&quot;title&quot;:&quot;RANCANG BANGUN SISTEM INFORMASI PENJUALAN GAS LPG 3 KG DI PT. NAFA ENERGI INDONESIA BOTOLINGGO, BONDOWOSO&quot;,&quot;author&quot;:[{&quot;family&quot;:&quot;Dewi&quot;,&quot;given&quot;:&quot;Alfien Fitriana&quot;,&quot;parse-names&quot;:false,&quot;dropping-particle&quot;:&quot;&quot;,&quot;non-dropping-particle&quot;:&quot;&quot;},{&quot;family&quot;:&quot;Ghozali&quot;,&quot;given&quot;:&quot;R M&quot;,&quot;parse-names&quot;:false,&quot;dropping-particle&quot;:&quot;&quot;,&quot;non-dropping-particle&quot;:&quot;&quot;},{&quot;family&quot;:&quot;Budiono&quot;,&quot;given&quot;:&quot;Drs Karim&quot;,&quot;parse-names&quot;:false,&quot;dropping-particle&quot;:&quot;&quot;,&quot;non-dropping-particle&quot;:&quot;&quot;}],&quot;container-title&quot;:&quot;Jurnal Manajemen Bisnis dan Manajemen Keuangan&quot;,&quot;URL&quot;:&quot;www.jurnal.itsm.ac.id&quot;,&quot;issued&quot;:{&quot;date-parts&quot;:[[2023]]},&quot;issue&quot;:&quot;1&quot;,&quot;volume&quot;:&quot;4&quot;,&quot;container-title-short&quot;:&quot;&quot;},&quot;isTemporary&quot;:false,&quot;suppress-author&quot;:false,&quot;composite&quot;:false,&quot;author-only&quot;:false}]},{&quot;citationID&quot;:&quot;MENDELEY_CITATION_7a3c7e3c-a05a-421c-9b6c-be05a4658ec1&quot;,&quot;properties&quot;:{&quot;noteIndex&quot;:0},&quot;isEdited&quot;:false,&quot;manualOverride&quot;:{&quot;isManuallyOverridden&quot;:false,&quot;citeprocText&quot;:&quot;[5]&quot;,&quot;manualOverrideText&quot;:&quot;&quot;},&quot;citationTag&quot;:&quot;MENDELEY_CITATION_v3_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&quot;,&quot;citationItems&quot;:[{&quot;id&quot;:&quot;a3c0ff9f-903c-3b08-b310-bff01d047c3a&quot;,&quot;itemData&quot;:{&quot;type&quot;:&quot;article-journal&quot;,&quot;id&quot;:&quot;a3c0ff9f-903c-3b08-b310-bff01d047c3a&quot;,&quot;title&quot;:&quot;Optimization of LPG Distribution for a Multiplatform-Based LPG Marketplace&quot;,&quot;author&quot;:[{&quot;family&quot;:&quot;Budianto&quot;,&quot;given&quot;:&quot;Herman&quot;,&quot;parse-names&quot;:false,&quot;dropping-particle&quot;:&quot;&quot;,&quot;non-dropping-particle&quot;:&quot;&quot;},{&quot;family&quot;:&quot;Mustaqin&quot;,&quot;given&quot;:&quot;Farhan Faisal Zainul&quot;,&quot;parse-names&quot;:false,&quot;dropping-particle&quot;:&quot;&quot;,&quot;non-dropping-particle&quot;:&quot;&quot;},{&quot;family&quot;:&quot;Setiawan&quot;,&quot;given&quot;:&quot;Esther Irawati&quot;,&quot;parse-names&quot;:false,&quot;dropping-particle&quot;:&quot;&quot;,&quot;non-dropping-particle&quot;:&quot;&quot;},{&quot;family&quot;:&quot;Santoso&quot;,&quot;given&quot;:&quot;Joan&quot;,&quot;parse-names&quot;:false,&quot;dropping-particle&quot;:&quot;&quot;,&quot;non-dropping-particle&quot;:&quot;&quot;}],&quot;container-title&quot;:&quot;International Journal of Engineering, Science and Information Technology&quot;,&quot;DOI&quot;:&quot;10.52088/ijesty.v5i3.994&quot;,&quot;ISSN&quot;:&quot;27752674&quot;,&quot;issued&quot;:{&quot;date-parts&quot;:[[2025,7,1]]},&quot;page&quot;:&quot;327-336&quot;,&quot;abstract&quot;:&quot;Marketplace applications have become an essential digital solution supporting online transactions, including LPG distribution. The development of this application adopts a multiplatform approach, enabling the application to run on various devices, particularly Android platforms and websites. Using the React Native framework, developers can build applications with a single, efficient codebase for multiple platforms. This study aims to provide users with convenience in purchasing LPG without leaving their homes while offering a more practical and effective user experience. This research includes features for selling, buying, payment, and delivery via courier. The transaction feature facilitates sellers' recording of sales within the application. The results of alpha testing indicate that the Elpijiku marketplace app works well despite some significant errors or bugs. However, acceptance testing results were very positive, with 91% of respondents rating the application and user experience as good. These findings indicate that the Elpijiku application meets user needs in terms of convenience and efficiency and is suitable for use as a digital solution for LPG distribution.&quot;,&quot;publisher&quot;:&quot;Malikussaleh University&quot;,&quot;issue&quot;:&quot;3&quot;,&quot;volume&quot;:&quot;5&quot;},&quot;isTemporary&quot;:false,&quot;suppress-author&quot;:false,&quot;composite&quot;:false,&quot;author-only&quot;:false}]},{&quot;citationID&quot;:&quot;MENDELEY_CITATION_47cdd684-1c0d-4172-924d-579eded64410&quot;,&quot;properties&quot;:{&quot;noteIndex&quot;:0},&quot;isEdited&quot;:false,&quot;manualOverride&quot;:{&quot;isManuallyOverridden&quot;:false,&quot;citeprocText&quot;:&quot;[6]&quot;,&quot;manualOverrideText&quot;:&quot;&quot;},&quot;citationTag&quot;:&quot;MENDELEY_CITATION_v3_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&quot;,&quot;citationItems&quot;:[{&quot;id&quot;:&quot;1a30af34-9986-3cf9-800e-84adeed49235&quot;,&quot;itemData&quot;:{&quot;type&quot;:&quot;article-journal&quot;,&quot;id&quot;:&quot;1a30af34-9986-3cf9-800e-84adeed49235&quot;,&quot;title&quot;:&quot;Multi-Tenant Architecture: A Comprehensive Framework for Building Scalable SaaS Applications&quot;,&quot;author&quot;:[{&quot;family&quot;:&quot;Shinu Pushpan&quot;,&quot;given&quot;:&quot;&quot;,&quot;parse-names&quot;:false,&quot;dropping-particle&quot;:&quot;&quot;,&quot;non-dropping-particle&quot;:&quot;&quot;}],&quot;container-title&quot;:&quot;International Journal of Scientific Research in Computer Science, Engineering and Information Technology&quot;,&quot;DOI&quot;:&quot;10.32628/cseit241061151&quot;,&quot;issued&quot;:{&quot;date-parts&quot;:[[2024,11,30]]},&quot;page&quot;:&quot;1117-1126&quot;,&quot;abstract&quot;:&quot;Multi-tenant architecture has emerged as a fundamental paradigm in modern software development, particularly in Software as a Service (SaaS) applications where multiple organizations share computing resources while maintaining data isolation. This article presents a comprehensive framework for understanding and implementing multi-tenant systems, focusing on essential architectural decisions and design patterns that ensure scalability, security, and resource efficiency. The article examines the evolution from single-tenant to multi-tenant architectures, analyzes various data partitioning strategies, and explores critical aspects of tenant isolation, authentication, and authorization mechanisms. The article addresses key challenges in performance optimization, resource allocation, and security implementation, providing practical insights into database design approaches and caching strategies. Through a structured approach, this article bridges the gap between theoretical concepts and practical implementation, offering developers and architects a foundation for building robust multi-tenant systems. The findings emphasize the importance of balanced architectural decisions that accommodate both technical requirements and business objectives while maintaining system integrity and tenant isolation. This article contributes to the growing body of knowledge in cloud computing and distributed systems, providing practitioners with actionable insights for developing scalable multi-tenant applications.&quot;,&quot;publisher&quot;:&quot;Technoscience Academy&quot;,&quot;issue&quot;:&quot;6&quot;,&quot;volume&quot;:&quot;10&quot;,&quot;container-title-short&quot;:&quot;&quot;},&quot;isTemporary&quot;:false,&quot;suppress-author&quot;:false,&quot;composite&quot;:false,&quot;author-only&quot;:false}]},{&quot;citationID&quot;:&quot;MENDELEY_CITATION_6a2c875b-5f2c-4a35-bdfa-6a9f63fd9413&quot;,&quot;properties&quot;:{&quot;noteIndex&quot;:0},&quot;isEdited&quot;:false,&quot;manualOverride&quot;:{&quot;isManuallyOverridden&quot;:false,&quot;citeprocText&quot;:&quot;[7], [8]&quot;,&quot;manualOverrideText&quot;:&quot;&quot;},&quot;citationTag&quot;:&quot;MENDELEY_CITATION_v3_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&quot;,&quot;citationItems&quot;:[{&quot;id&quot;:&quot;ac5dd827-5bb1-31a8-9178-b598f2e08e4c&quot;,&quot;itemData&quot;:{&quot;type&quot;:&quot;webpage&quot;,&quot;id&quot;:&quot;ac5dd827-5bb1-31a8-9178-b598f2e08e4c&quot;,&quot;title&quot;:&quot;React Documentation: A JavaScript Library for Building User Interfaces&quot;,&quot;author&quot;:[{&quot;family&quot;:&quot;Meta Platforms&quot;,&quot;given&quot;:&quot;Inc.&quot;,&quot;parse-names&quot;:false,&quot;dropping-particle&quot;:&quot;&quot;,&quot;non-dropping-particle&quot;:&quot;&quot;}],&quot;accessed&quot;:{&quot;date-parts&quot;:[[2025,12,26]]},&quot;URL&quot;:&quot;https://react.dev&quot;,&quot;issued&quot;:{&quot;date-parts&quot;:[[2025]]},&quot;container-title-short&quot;:&quot;&quot;},&quot;isTemporary&quot;:false,&quot;suppress-author&quot;:false,&quot;composite&quot;:false,&quot;author-only&quot;:false},{&quot;id&quot;:&quot;52303310-b2d1-34c9-8e52-7bab679770c4&quot;,&quot;itemData&quot;:{&quot;type&quot;:&quot;webpage&quot;,&quot;id&quot;:&quot;52303310-b2d1-34c9-8e52-7bab679770c4&quot;,&quot;title&quot;:&quot;NestJS Documentation: A Progressive Node.js Framework&quot;,&quot;author&quot;:[{&quot;family&quot;:&quot;NestJS Contributors&quot;,&quot;given&quot;:&quot;&quot;,&quot;parse-names&quot;:false,&quot;dropping-particle&quot;:&quot;&quot;,&quot;non-dropping-particle&quot;:&quot;&quot;}],&quot;accessed&quot;:{&quot;date-parts&quot;:[[2025,12,26]]},&quot;URL&quot;:&quot;https://docs.nestjs.com&quot;,&quot;issued&quot;:{&quot;date-parts&quot;:[[2025]]}},&quot;isTemporary&quot;:false}]},{&quot;citationID&quot;:&quot;MENDELEY_CITATION_06d802a9-844b-4752-845c-36ca8ee7d0be&quot;,&quot;properties&quot;:{&quot;noteIndex&quot;:0},&quot;isEdited&quot;:false,&quot;manualOverride&quot;:{&quot;isManuallyOverridden&quot;:false,&quot;citeprocText&quot;:&quot;[9]&quot;,&quot;manualOverrideText&quot;:&quot;&quot;},&quot;citationTag&quot;:&quot;MENDELEY_CITATION_v3_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&quot;,&quot;citationItems&quot;:[{&quot;id&quot;:&quot;6efc293e-3d0a-316e-9913-8ff21c1b6708&quot;,&quot;itemData&quot;:{&quot;type&quot;:&quot;book&quot;,&quot;id&quot;:&quot;6efc293e-3d0a-316e-9913-8ff21c1b6708&quot;,&quot;title&quot;:&quot;Information Technology for Management: On-Demand Strategies for Performance, Growth, and Sustainability (14th ed.)&quot;,&quot;author&quot;:[{&quot;family&quot;:&quot;Turban&quot;,&quot;given&quot;:&quot;E&quot;,&quot;parse-names&quot;:false,&quot;dropping-particle&quot;:&quot;&quot;,&quot;non-dropping-particle&quot;:&quot;&quot;},{&quot;family&quot;:&quot;Pollard&quot;,&quot;given&quot;:&quot;C&quot;,&quot;parse-names&quot;:false,&quot;dropping-particle&quot;:&quot;&quot;,&quot;non-dropping-particle&quot;:&quot;&quot;},{&quot;family&quot;:&quot;Wood&quot;,&quot;given&quot;:&quot;G&quot;,&quot;parse-names&quot;:false,&quot;dropping-particle&quot;:&quot;&quot;,&quot;non-dropping-particle&quot;:&quot;&quot;}],&quot;accessed&quot;:{&quot;date-parts&quot;:[[2025,12,26]]},&quot;URL&quot;:&quot;https://books.google.co.id/books/about/Information_Technology_for_Management.html?id=hJZXDwAAQBAJ&amp;redir_esc=y&quot;,&quot;issued&quot;:{&quot;date-parts&quot;:[[2023]]},&quot;number-of-pages&quot;:&quot;40-45&quot;,&quot;edition&quot;:&quot;14&quot;,&quot;container-title-short&quot;:&quot;&quot;},&quot;isTemporary&quot;:false,&quot;suppress-author&quot;:false,&quot;composite&quot;:false,&quot;author-only&quot;:false}]}]"/>
+    <we:property name="MENDELEY_BIBLIOGRAPHY_LAST_MODIFIED" value="1766822794852"/>
+    <we:property name="MENDELEY_CITATIONS" value="[{&quot;citationID&quot;:&quot;MENDELEY_CITATION_1cba8bf4-8057-460e-9347-1da179afcc54&quot;,&quot;properties&quot;:{&quot;noteIndex&quot;:0},&quot;isEdited&quot;:false,&quot;manualOverride&quot;:{&quot;isManuallyOverridden&quot;:false,&quot;citeprocText&quot;:&quot;[1]&quot;,&quot;manualOverrideText&quot;:&quot;&quot;},&quot;citationTag&quot;:&quot;MENDELEY_CITATION_v3_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&quot;,&quot;citationItems&quot;:[{&quot;id&quot;:&quot;db5f0a69-11e1-31bd-a007-dcb100cad7c3&quot;,&quot;itemData&quot;:{&quot;type&quot;:&quot;webpage&quot;,&quot;id&quot;:&quot;db5f0a69-11e1-31bd-a007-dcb100cad7c3&quot;,&quot;title&quot;:&quot;Penyaluran LPG 3 Kg Tembus 8,2 Juta Ton pada 2024&quot;,&quot;author&quot;:[{&quot;family&quot;:&quot;Pertamina&quot;,&quot;given&quot;:&quot;&quot;,&quot;parse-names&quot;:false,&quot;dropping-particle&quot;:&quot;&quot;,&quot;non-dropping-particle&quot;:&quot;&quot;}],&quot;container-title&quot;:&quot;Kontan&quot;,&quot;accessed&quot;:{&quot;date-parts&quot;:[[2025,12,26]]},&quot;URL&quot;:&quot;https://industri.kontan.co.id/news/pertamina-penyaluran-lpg-3-kg-tembus-82-juta-ton-pada-2024&quot;,&quot;issued&quot;:{&quot;date-parts&quot;:[[2025,6]]},&quot;language&quot;:&quot;Indonesia&quot;,&quot;container-title-short&quot;:&quot;&quot;},&quot;isTemporary&quot;:false,&quot;suppress-author&quot;:false,&quot;composite&quot;:false,&quot;author-only&quot;:false}]},{&quot;citationID&quot;:&quot;MENDELEY_CITATION_4bafd109-fca3-4569-8c20-2e0692c3ab9f&quot;,&quot;properties&quot;:{&quot;noteIndex&quot;:0},&quot;isEdited&quot;:false,&quot;manualOverride&quot;:{&quot;isManuallyOverridden&quot;:false,&quot;citeprocText&quot;:&quot;[2]&quot;,&quot;manualOverrideText&quot;:&quot;&quot;},&quot;citationTag&quot;:&quot;MENDELEY_CITATION_v3_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&quot;,&quot;citationItems&quot;:[{&quot;id&quot;:&quot;44ff0d65-16cb-3025-af63-48883f162e85&quot;,&quot;itemData&quot;:{&quot;type&quot;:&quot;webpage&quot;,&quot;id&quot;:&quot;44ff0d65-16cb-3025-af63-48883f162e85&quot;,&quot;title&quot;:&quot;Pedoman Distribusi LPG Tabung di Indonesia&quot;,&quot;author&quot;:[{&quot;family&quot;:&quot;BPH Migas&quot;,&quot;given&quot;:&quot;&quot;,&quot;parse-names&quot;:false,&quot;dropping-particle&quot;:&quot;&quot;,&quot;non-dropping-particle&quot;:&quot;&quot;}],&quot;accessed&quot;:{&quot;date-parts&quot;:[[2025,12,26]]},&quot;URL&quot;:&quot;https://migas.esdm.go.id/post/menteri-esdm-tetapkan-kepmen-esdm-tentang-petunjuk-teknis-pendistribusian-isi-ulang-lpg-tertentu-tepat-sasaran&quot;,&quot;issued&quot;:{&quot;date-parts&quot;:[[2024]]}},&quot;isTemporary&quot;:false,&quot;suppress-author&quot;:false,&quot;composite&quot;:false,&quot;author-only&quot;:false}]},{&quot;citationID&quot;:&quot;MENDELEY_CITATION_e7d43d1a-8a36-45fd-9239-0a5a660f2ff1&quot;,&quot;properties&quot;:{&quot;noteIndex&quot;:0},&quot;isEdited&quot;:false,&quot;manualOverride&quot;:{&quot;isManuallyOverridden&quot;:false,&quot;citeprocText&quot;:&quot;[3]&quot;,&quot;manualOverrideText&quot;:&quot;&quot;},&quot;citationTag&quot;:&quot;MENDELEY_CITATION_v3_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&quot;,&quot;citationItems&quot;:[{&quot;id&quot;:&quot;5d1bd1ba-82f8-36e2-8457-cbdc8da3427b&quot;,&quot;itemData&quot;:{&quot;type&quot;:&quot;article-journal&quot;,&quot;id&quot;:&quot;5d1bd1ba-82f8-36e2-8457-cbdc8da3427b&quot;,&quot;title&quot;:&quot;Perancangan Sistem Informasi Manajemen Distribusi Gas Elpiji Berbasis Web pada PT. Mita Kalbar Pontianak&quot;,&quot;author&quot;:[{&quot;family&quot;:&quot;Jayanti&quot;,&quot;given&quot;:&quot;Wanty Eka&quot;,&quot;parse-names&quot;:false,&quot;dropping-particle&quot;:&quot;&quot;,&quot;non-dropping-particle&quot;:&quot;&quot;},{&quot;family&quot;:&quot;Meilinda&quot;,&quot;given&quot;:&quot;Eva&quot;,&quot;parse-names&quot;:false,&quot;dropping-particle&quot;:&quot;&quot;,&quot;non-dropping-particle&quot;:&quot;&quot;},{&quot;family&quot;:&quot;Desi&quot;,&quot;given&quot;:&quot;Desi&quot;,&quot;parse-names&quot;:false,&quot;dropping-particle&quot;:&quot;&quot;,&quot;non-dropping-particle&quot;:&quot;&quot;}],&quot;container-title&quot;:&quot;Jurnal Khatulistiwa Informatika&quot;,&quot;issued&quot;:{&quot;date-parts&quot;:[[2018]]},&quot;abstract&quot;:&quot;Penelitian ini mengenai perancangan sistem informasi manajemen distribusi gas elpiji berbasis web pada PT.Mita Kalbar Pontianak. Pada PT tersebut masih menggunakan sistem pencatatan dan Microsoft excel sebagaimedia penyimpanan data penyaluran serta menggunakan sistem tertulis untuk pembuatan laporanpendapatan setiap harinya. Sistem ini dirancang dengan bahasa pemograman hyper text preprocessor (PHP)dan hyper text markup language (HTML) sebagai web editor. MySQL sebagai basis data dan Xampp sebagai webserver. Metode yang digunakan pada pengembangan perangkat lunak ini menggunakan model waterfall atauyang sering disebut metode air terjun dan teknik pengumpulan data yang digunakan yaitu pengamatanlangsung (observasi), Wawancara (Interview) serta Studi Pustaka. Dengan adanya rancangan sistem inidiharapkan dapat digunakan untuk membangun sistem informasi sebagai media penyimpanan datadistribusi dan laporan secara terkomputerisasi serta digunakan untuk membangun sistem informasi dalamupaya mengatur dan mengawasi penyaluran gas elpiji kepada konsumen.&quot;,&quot;issue&quot;:&quot;2&quot;,&quot;volume&quot;:&quot;6&quot;,&quot;container-title-short&quot;:&quot;&quot;},&quot;isTemporary&quot;:false,&quot;suppress-author&quot;:false,&quot;composite&quot;:false,&quot;author-only&quot;:false}]},{&quot;citationID&quot;:&quot;MENDELEY_CITATION_acbffb0a-3229-4bfa-ba24-4df22a145339&quot;,&quot;properties&quot;:{&quot;noteIndex&quot;:0},&quot;isEdited&quot;:false,&quot;manualOverride&quot;:{&quot;isManuallyOverridden&quot;:false,&quot;citeprocText&quot;:&quot;[4]&quot;,&quot;manualOverrideText&quot;:&quot;&quot;},&quot;citationTag&quot;:&quot;MENDELEY_CITATION_v3_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&quot;,&quot;citationItems&quot;:[{&quot;id&quot;:&quot;d4fccd83-9f89-3bda-af40-ca648ecc2094&quot;,&quot;itemData&quot;:{&quot;type&quot;:&quot;report&quot;,&quot;id&quot;:&quot;d4fccd83-9f89-3bda-af40-ca648ecc2094&quot;,&quot;title&quot;:&quot;RANCANG BANGUN SISTEM INFORMASI PENJUALAN GAS LPG 3 KG DI PT. NAFA ENERGI INDONESIA BOTOLINGGO, BONDOWOSO&quot;,&quot;author&quot;:[{&quot;family&quot;:&quot;Dewi&quot;,&quot;given&quot;:&quot;Alfien Fitriana&quot;,&quot;parse-names&quot;:false,&quot;dropping-particle&quot;:&quot;&quot;,&quot;non-dropping-particle&quot;:&quot;&quot;},{&quot;family&quot;:&quot;Ghozali&quot;,&quot;given&quot;:&quot;R M&quot;,&quot;parse-names&quot;:false,&quot;dropping-particle&quot;:&quot;&quot;,&quot;non-dropping-particle&quot;:&quot;&quot;},{&quot;family&quot;:&quot;Budiono&quot;,&quot;given&quot;:&quot;Drs Karim&quot;,&quot;parse-names&quot;:false,&quot;dropping-particle&quot;:&quot;&quot;,&quot;non-dropping-particle&quot;:&quot;&quot;}],&quot;container-title&quot;:&quot;Jurnal Manajemen Bisnis dan Manajemen Keuangan&quot;,&quot;URL&quot;:&quot;www.jurnal.itsm.ac.id&quot;,&quot;issued&quot;:{&quot;date-parts&quot;:[[2023]]},&quot;issue&quot;:&quot;1&quot;,&quot;volume&quot;:&quot;4&quot;,&quot;container-title-short&quot;:&quot;&quot;},&quot;isTemporary&quot;:false,&quot;suppress-author&quot;:false,&quot;composite&quot;:false,&quot;author-only&quot;:false}]},{&quot;citationID&quot;:&quot;MENDELEY_CITATION_7a3c7e3c-a05a-421c-9b6c-be05a4658ec1&quot;,&quot;properties&quot;:{&quot;noteIndex&quot;:0},&quot;isEdited&quot;:false,&quot;manualOverride&quot;:{&quot;isManuallyOverridden&quot;:false,&quot;citeprocText&quot;:&quot;[5]&quot;,&quot;manualOverrideText&quot;:&quot;&quot;},&quot;citationTag&quot;:&quot;MENDELEY_CITATION_v3_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&quot;,&quot;citationItems&quot;:[{&quot;id&quot;:&quot;a3c0ff9f-903c-3b08-b310-bff01d047c3a&quot;,&quot;itemData&quot;:{&quot;type&quot;:&quot;article-journal&quot;,&quot;id&quot;:&quot;a3c0ff9f-903c-3b08-b310-bff01d047c3a&quot;,&quot;title&quot;:&quot;Optimization of LPG Distribution for a Multiplatform-Based LPG Marketplace&quot;,&quot;author&quot;:[{&quot;family&quot;:&quot;Budianto&quot;,&quot;given&quot;:&quot;Herman&quot;,&quot;parse-names&quot;:false,&quot;dropping-particle&quot;:&quot;&quot;,&quot;non-dropping-particle&quot;:&quot;&quot;},{&quot;family&quot;:&quot;Mustaqin&quot;,&quot;given&quot;:&quot;Farhan Faisal Zainul&quot;,&quot;parse-names&quot;:false,&quot;dropping-particle&quot;:&quot;&quot;,&quot;non-dropping-particle&quot;:&quot;&quot;},{&quot;family&quot;:&quot;Setiawan&quot;,&quot;given&quot;:&quot;Esther Irawati&quot;,&quot;parse-names&quot;:false,&quot;dropping-particle&quot;:&quot;&quot;,&quot;non-dropping-particle&quot;:&quot;&quot;},{&quot;family&quot;:&quot;Santoso&quot;,&quot;given&quot;:&quot;Joan&quot;,&quot;parse-names&quot;:false,&quot;dropping-particle&quot;:&quot;&quot;,&quot;non-dropping-particle&quot;:&quot;&quot;}],&quot;container-title&quot;:&quot;International Journal of Engineering, Science and Information Technology&quot;,&quot;DOI&quot;:&quot;10.52088/ijesty.v5i3.994&quot;,&quot;ISSN&quot;:&quot;27752674&quot;,&quot;issued&quot;:{&quot;date-parts&quot;:[[2025,7,1]]},&quot;page&quot;:&quot;327-336&quot;,&quot;abstract&quot;:&quot;Marketplace applications have become an essential digital solution supporting online transactions, including LPG distribution. The development of this application adopts a multiplatform approach, enabling the application to run on various devices, particularly Android platforms and websites. Using the React Native framework, developers can build applications with a single, efficient codebase for multiple platforms. This study aims to provide users with convenience in purchasing LPG without leaving their homes while offering a more practical and effective user experience. This research includes features for selling, buying, payment, and delivery via courier. The transaction feature facilitates sellers' recording of sales within the application. The results of alpha testing indicate that the Elpijiku marketplace app works well despite some significant errors or bugs. However, acceptance testing results were very positive, with 91% of respondents rating the application and user experience as good. These findings indicate that the Elpijiku application meets user needs in terms of convenience and efficiency and is suitable for use as a digital solution for LPG distribution.&quot;,&quot;publisher&quot;:&quot;Malikussaleh University&quot;,&quot;issue&quot;:&quot;3&quot;,&quot;volume&quot;:&quot;5&quot;},&quot;isTemporary&quot;:false,&quot;suppress-author&quot;:false,&quot;composite&quot;:false,&quot;author-only&quot;:false}]},{&quot;citationID&quot;:&quot;MENDELEY_CITATION_47cdd684-1c0d-4172-924d-579eded64410&quot;,&quot;properties&quot;:{&quot;noteIndex&quot;:0},&quot;isEdited&quot;:false,&quot;manualOverride&quot;:{&quot;isManuallyOverridden&quot;:false,&quot;citeprocText&quot;:&quot;[6]&quot;,&quot;manualOverrideText&quot;:&quot;&quot;},&quot;citationTag&quot;:&quot;MENDELEY_CITATION_v3_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&quot;,&quot;citationItems&quot;:[{&quot;id&quot;:&quot;1a30af34-9986-3cf9-800e-84adeed49235&quot;,&quot;itemData&quot;:{&quot;type&quot;:&quot;article-journal&quot;,&quot;id&quot;:&quot;1a30af34-9986-3cf9-800e-84adeed49235&quot;,&quot;title&quot;:&quot;Multi-Tenant Architecture: A Comprehensive Framework for Building Scalable SaaS Applications&quot;,&quot;author&quot;:[{&quot;family&quot;:&quot;Shinu Pushpan&quot;,&quot;given&quot;:&quot;&quot;,&quot;parse-names&quot;:false,&quot;dropping-particle&quot;:&quot;&quot;,&quot;non-dropping-particle&quot;:&quot;&quot;}],&quot;container-title&quot;:&quot;International Journal of Scientific Research in Computer Science, Engineering and Information Technology&quot;,&quot;DOI&quot;:&quot;10.32628/cseit241061151&quot;,&quot;issued&quot;:{&quot;date-parts&quot;:[[2024,11,30]]},&quot;page&quot;:&quot;1117-1126&quot;,&quot;abstract&quot;:&quot;Multi-tenant architecture has emerged as a fundamental paradigm in modern software development, particularly in Software as a Service (SaaS) applications where multiple organizations share computing resources while maintaining data isolation. This article presents a comprehensive framework for understanding and implementing multi-tenant systems, focusing on essential architectural decisions and design patterns that ensure scalability, security, and resource efficiency. The article examines the evolution from single-tenant to multi-tenant architectures, analyzes various data partitioning strategies, and explores critical aspects of tenant isolation, authentication, and authorization mechanisms. The article addresses key challenges in performance optimization, resource allocation, and security implementation, providing practical insights into database design approaches and caching strategies. Through a structured approach, this article bridges the gap between theoretical concepts and practical implementation, offering developers and architects a foundation for building robust multi-tenant systems. The findings emphasize the importance of balanced architectural decisions that accommodate both technical requirements and business objectives while maintaining system integrity and tenant isolation. This article contributes to the growing body of knowledge in cloud computing and distributed systems, providing practitioners with actionable insights for developing scalable multi-tenant applications.&quot;,&quot;publisher&quot;:&quot;Technoscience Academy&quot;,&quot;issue&quot;:&quot;6&quot;,&quot;volume&quot;:&quot;10&quot;,&quot;container-title-short&quot;:&quot;&quot;},&quot;isTemporary&quot;:false,&quot;suppress-author&quot;:false,&quot;composite&quot;:false,&quot;author-only&quot;:false}]},{&quot;citationID&quot;:&quot;MENDELEY_CITATION_6a2c875b-5f2c-4a35-bdfa-6a9f63fd9413&quot;,&quot;properties&quot;:{&quot;noteIndex&quot;:0},&quot;isEdited&quot;:false,&quot;manualOverride&quot;:{&quot;isManuallyOverridden&quot;:false,&quot;citeprocText&quot;:&quot;[7], [8]&quot;,&quot;manualOverrideText&quot;:&quot;&quot;},&quot;citationTag&quot;:&quot;MENDELEY_CITATION_v3_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&quot;,&quot;citationItems&quot;:[{&quot;id&quot;:&quot;ac5dd827-5bb1-31a8-9178-b598f2e08e4c&quot;,&quot;itemData&quot;:{&quot;type&quot;:&quot;webpage&quot;,&quot;id&quot;:&quot;ac5dd827-5bb1-31a8-9178-b598f2e08e4c&quot;,&quot;title&quot;:&quot;React Documentation: A JavaScript Library for Building User Interfaces&quot;,&quot;author&quot;:[{&quot;family&quot;:&quot;Meta Platforms&quot;,&quot;given&quot;:&quot;Inc.&quot;,&quot;parse-names&quot;:false,&quot;dropping-particle&quot;:&quot;&quot;,&quot;non-dropping-particle&quot;:&quot;&quot;}],&quot;accessed&quot;:{&quot;date-parts&quot;:[[2025,12,26]]},&quot;URL&quot;:&quot;https://react.dev&quot;,&quot;issued&quot;:{&quot;date-parts&quot;:[[2025]]},&quot;container-title-short&quot;:&quot;&quot;},&quot;isTemporary&quot;:false,&quot;suppress-author&quot;:false,&quot;composite&quot;:false,&quot;author-only&quot;:false},{&quot;id&quot;:&quot;52303310-b2d1-34c9-8e52-7bab679770c4&quot;,&quot;itemData&quot;:{&quot;type&quot;:&quot;webpage&quot;,&quot;id&quot;:&quot;52303310-b2d1-34c9-8e52-7bab679770c4&quot;,&quot;title&quot;:&quot;NestJS Documentation: A Progressive Node.js Framework&quot;,&quot;author&quot;:[{&quot;family&quot;:&quot;NestJS Contributors&quot;,&quot;given&quot;:&quot;&quot;,&quot;parse-names&quot;:false,&quot;dropping-particle&quot;:&quot;&quot;,&quot;non-dropping-particle&quot;:&quot;&quot;}],&quot;accessed&quot;:{&quot;date-parts&quot;:[[2025,12,26]]},&quot;URL&quot;:&quot;https://docs.nestjs.com&quot;,&quot;issued&quot;:{&quot;date-parts&quot;:[[2025]]}},&quot;isTemporary&quot;:false}]},{&quot;citationID&quot;:&quot;MENDELEY_CITATION_06d802a9-844b-4752-845c-36ca8ee7d0be&quot;,&quot;properties&quot;:{&quot;noteIndex&quot;:0},&quot;isEdited&quot;:false,&quot;manualOverride&quot;:{&quot;isManuallyOverridden&quot;:false,&quot;citeprocText&quot;:&quot;[9]&quot;,&quot;manualOverrideText&quot;:&quot;&quot;},&quot;citationTag&quot;:&quot;MENDELEY_CITATION_v3_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&quot;,&quot;citationItems&quot;:[{&quot;id&quot;:&quot;6efc293e-3d0a-316e-9913-8ff21c1b6708&quot;,&quot;itemData&quot;:{&quot;type&quot;:&quot;book&quot;,&quot;id&quot;:&quot;6efc293e-3d0a-316e-9913-8ff21c1b6708&quot;,&quot;title&quot;:&quot;Information Technology for Management: On-Demand Strategies for Performance, Growth, and Sustainability (14th ed.)&quot;,&quot;author&quot;:[{&quot;family&quot;:&quot;Turban&quot;,&quot;given&quot;:&quot;E&quot;,&quot;parse-names&quot;:false,&quot;dropping-particle&quot;:&quot;&quot;,&quot;non-dropping-particle&quot;:&quot;&quot;},{&quot;family&quot;:&quot;Pollard&quot;,&quot;given&quot;:&quot;C&quot;,&quot;parse-names&quot;:false,&quot;dropping-particle&quot;:&quot;&quot;,&quot;non-dropping-particle&quot;:&quot;&quot;},{&quot;family&quot;:&quot;Wood&quot;,&quot;given&quot;:&quot;G&quot;,&quot;parse-names&quot;:false,&quot;dropping-particle&quot;:&quot;&quot;,&quot;non-dropping-particle&quot;:&quot;&quot;}],&quot;accessed&quot;:{&quot;date-parts&quot;:[[2025,12,26]]},&quot;issued&quot;:{&quot;date-parts&quot;:[[2023]]},&quot;number-of-pages&quot;:&quot;40-45&quot;,&quot;edition&quot;:&quot;14&quot;},&quot;isTemporary&quot;:false,&quot;suppress-author&quot;:false,&quot;composite&quot;:false,&quot;author-only&quot;:false}]},{&quot;citationID&quot;:&quot;MENDELEY_CITATION_3a03f3ae-029f-4773-863a-2d551ca329ee&quot;,&quot;properties&quot;:{&quot;noteIndex&quot;:0},&quot;isEdited&quot;:false,&quot;manualOverride&quot;:{&quot;isManuallyOverridden&quot;:false,&quot;citeprocText&quot;:&quot;[10]&quot;,&quot;manualOverrideText&quot;:&quot;&quot;},&quot;citationTag&quot;:&quot;MENDELEY_CITATION_v3_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&quot;,&quot;citationItems&quot;:[{&quot;id&quot;:&quot;28f47a0c-836d-3986-8867-230538480f42&quot;,&quot;itemData&quot;:{&quot;type&quot;:&quot;book&quot;,&quot;id&quot;:&quot;28f47a0c-836d-3986-8867-230538480f42&quot;,&quot;title&quot;:&quot;Management Information Systems: Managing the Digital Firm (17th ed.)&quot;,&quot;author&quot;:[{&quot;family&quot;:&quot;Laudon&quot;,&quot;given&quot;:&quot;Kenneth C&quot;,&quot;parse-names&quot;:false,&quot;dropping-particle&quot;:&quot;&quot;,&quot;non-dropping-particle&quot;:&quot;&quot;},{&quot;family&quot;:&quot;Laudon&quot;,&quot;given&quot;:&quot;Jane Price&quot;,&quot;parse-names&quot;:false,&quot;dropping-particle&quot;:&quot;&quot;,&quot;non-dropping-particle&quot;:&quot;&quot;}],&quot;issued&quot;:{&quot;date-parts&quot;:[[2023]]}},&quot;isTemporary&quot;:false,&quot;suppress-author&quot;:false,&quot;composite&quot;:false,&quot;author-only&quot;:false}]},{&quot;citationID&quot;:&quot;MENDELEY_CITATION_e47a29f5-7c64-40f5-80b5-6105f893848c&quot;,&quot;properties&quot;:{&quot;noteIndex&quot;:0},&quot;isEdited&quot;:false,&quot;manualOverride&quot;:{&quot;isManuallyOverridden&quot;:false,&quot;citeprocText&quot;:&quot;[3]&quot;,&quot;manualOverrideText&quot;:&quot;&quot;},&quot;citationTag&quot;:&quot;MENDELEY_CITATION_v3_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&quot;,&quot;citationItems&quot;:[{&quot;id&quot;:&quot;5d1bd1ba-82f8-36e2-8457-cbdc8da3427b&quot;,&quot;itemData&quot;:{&quot;type&quot;:&quot;article-journal&quot;,&quot;id&quot;:&quot;5d1bd1ba-82f8-36e2-8457-cbdc8da3427b&quot;,&quot;title&quot;:&quot;Perancangan Sistem Informasi Manajemen Distribusi Gas Elpiji Berbasis Web pada PT. Mita Kalbar Pontianak&quot;,&quot;author&quot;:[{&quot;family&quot;:&quot;Jayanti&quot;,&quot;given&quot;:&quot;Wanty Eka&quot;,&quot;parse-names&quot;:false,&quot;dropping-particle&quot;:&quot;&quot;,&quot;non-dropping-particle&quot;:&quot;&quot;},{&quot;family&quot;:&quot;Meilinda&quot;,&quot;given&quot;:&quot;Eva&quot;,&quot;parse-names&quot;:false,&quot;dropping-particle&quot;:&quot;&quot;,&quot;non-dropping-particle&quot;:&quot;&quot;},{&quot;family&quot;:&quot;Desi&quot;,&quot;given&quot;:&quot;Desi&quot;,&quot;parse-names&quot;:false,&quot;dropping-particle&quot;:&quot;&quot;,&quot;non-dropping-particle&quot;:&quot;&quot;}],&quot;container-title&quot;:&quot;Jurnal Khatulistiwa Informatika&quot;,&quot;issued&quot;:{&quot;date-parts&quot;:[[2018]]},&quot;abstract&quot;:&quot;Penelitian ini mengenai perancangan sistem informasi manajemen distribusi gas elpiji berbasis web pada PT.Mita Kalbar Pontianak. Pada PT tersebut masih menggunakan sistem pencatatan dan Microsoft excel sebagaimedia penyimpanan data penyaluran serta menggunakan sistem tertulis untuk pembuatan laporanpendapatan setiap harinya. Sistem ini dirancang dengan bahasa pemograman hyper text preprocessor (PHP)dan hyper text markup language (HTML) sebagai web editor. MySQL sebagai basis data dan Xampp sebagai webserver. Metode yang digunakan pada pengembangan perangkat lunak ini menggunakan model waterfall atauyang sering disebut metode air terjun dan teknik pengumpulan data yang digunakan yaitu pengamatanlangsung (observasi), Wawancara (Interview) serta Studi Pustaka. Dengan adanya rancangan sistem inidiharapkan dapat digunakan untuk membangun sistem informasi sebagai media penyimpanan datadistribusi dan laporan secara terkomputerisasi serta digunakan untuk membangun sistem informasi dalamupaya mengatur dan mengawasi penyaluran gas elpiji kepada konsumen.&quot;,&quot;issue&quot;:&quot;2&quot;,&quot;volume&quot;:&quot;6&quot;,&quot;container-title-short&quot;:&quot;&quot;},&quot;isTemporary&quot;:false,&quot;suppress-author&quot;:false,&quot;composite&quot;:false,&quot;author-only&quot;:false}]},{&quot;citationID&quot;:&quot;MENDELEY_CITATION_97186182-8218-4d40-b62f-fbe9a9a44296&quot;,&quot;properties&quot;:{&quot;noteIndex&quot;:0},&quot;isEdited&quot;:false,&quot;manualOverride&quot;:{&quot;isManuallyOverridden&quot;:false,&quot;citeprocText&quot;:&quot;[11]&quot;,&quot;manualOverrideText&quot;:&quot;&quot;},&quot;citationTag&quot;:&quot;MENDELEY_CITATION_v3_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&quot;,&quot;citationItems&quot;:[{&quot;id&quot;:&quot;481de7de-fc4e-3c4e-96aa-2fa68b24042c&quot;,&quot;itemData&quot;:{&quot;type&quot;:&quot;report&quot;,&quot;id&quot;:&quot;481de7de-fc4e-3c4e-96aa-2fa68b24042c&quot;,&quot;title&quot;:&quot;SISTEM INFORMASI PENDISTRIBUSIAN GAS LPG 3KG PADA PT. CLIENSA SATRIA CITA GEMILANG DI KABUPATEN SUBANG&quot;,&quot;author&quot;:[{&quot;family&quot;:&quot;Tjahjo Utomo&quot;,&quot;given&quot;:&quot;Bambang&quot;,&quot;parse-names&quot;:false,&quot;dropping-particle&quot;:&quot;&quot;,&quot;non-dropping-particle&quot;:&quot;&quot;},{&quot;family&quot;:&quot;Destriani&quot;,&quot;given&quot;:&quot;Maya&quot;,&quot;parse-names&quot;:false,&quot;dropping-particle&quot;:&quot;&quot;,&quot;non-dropping-particle&quot;:&quot;&quot;},{&quot;family&quot;:&quot;Komputer&quot;,&quot;given&quot;:&quot;Ilmu&quot;,&quot;parse-names&quot;:false,&quot;dropping-particle&quot;:&quot;&quot;,&quot;non-dropping-particle&quot;:&quot;&quot;},{&quot;family&quot;:&quot;Subang&quot;,&quot;given&quot;:&quot;Universitas&quot;,&quot;parse-names&quot;:false,&quot;dropping-particle&quot;:&quot;&quot;,&quot;non-dropping-particle&quot;:&quot;&quot;}],&quot;URL&quot;:&quot;http://ejournal.unsub.ac.id/index.php/Fasilkom&quot;,&quot;issued&quot;:{&quot;date-parts&quot;:[[2022]]},&quot;issue&quot;:&quot;2&quot;,&quot;volume&quot;:&quot;VIII&quot;},&quot;isTemporary&quot;:false,&quot;suppress-author&quot;:false,&quot;composite&quot;:false,&quot;author-only&quot;:false}]},{&quot;citationID&quot;:&quot;MENDELEY_CITATION_dada93f4-340c-45f1-9354-899b51c9fa37&quot;,&quot;properties&quot;:{&quot;noteIndex&quot;:0},&quot;isEdited&quot;:false,&quot;manualOverride&quot;:{&quot;isManuallyOverridden&quot;:false,&quot;citeprocText&quot;:&quot;[3]&quot;,&quot;manualOverrideText&quot;:&quot;&quot;},&quot;citationTag&quot;:&quot;MENDELEY_CITATION_v3_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&quot;,&quot;citationItems&quot;:[{&quot;id&quot;:&quot;5d1bd1ba-82f8-36e2-8457-cbdc8da3427b&quot;,&quot;itemData&quot;:{&quot;type&quot;:&quot;article-journal&quot;,&quot;id&quot;:&quot;5d1bd1ba-82f8-36e2-8457-cbdc8da3427b&quot;,&quot;title&quot;:&quot;Perancangan Sistem Informasi Manajemen Distribusi Gas Elpiji Berbasis Web pada PT. Mita Kalbar Pontianak&quot;,&quot;author&quot;:[{&quot;family&quot;:&quot;Jayanti&quot;,&quot;given&quot;:&quot;Wanty Eka&quot;,&quot;parse-names&quot;:false,&quot;dropping-particle&quot;:&quot;&quot;,&quot;non-dropping-particle&quot;:&quot;&quot;},{&quot;family&quot;:&quot;Meilinda&quot;,&quot;given&quot;:&quot;Eva&quot;,&quot;parse-names&quot;:false,&quot;dropping-particle&quot;:&quot;&quot;,&quot;non-dropping-particle&quot;:&quot;&quot;},{&quot;family&quot;:&quot;Desi&quot;,&quot;given&quot;:&quot;Desi&quot;,&quot;parse-names&quot;:false,&quot;dropping-particle&quot;:&quot;&quot;,&quot;non-dropping-particle&quot;:&quot;&quot;}],&quot;container-title&quot;:&quot;Jurnal Khatulistiwa Informatika&quot;,&quot;issued&quot;:{&quot;date-parts&quot;:[[2018]]},&quot;abstract&quot;:&quot;Penelitian ini mengenai perancangan sistem informasi manajemen distribusi gas elpiji berbasis web pada PT.Mita Kalbar Pontianak. Pada PT tersebut masih menggunakan sistem pencatatan dan Microsoft excel sebagaimedia penyimpanan data penyaluran serta menggunakan sistem tertulis untuk pembuatan laporanpendapatan setiap harinya. Sistem ini dirancang dengan bahasa pemograman hyper text preprocessor (PHP)dan hyper text markup language (HTML) sebagai web editor. MySQL sebagai basis data dan Xampp sebagai webserver. Metode yang digunakan pada pengembangan perangkat lunak ini menggunakan model waterfall atauyang sering disebut metode air terjun dan teknik pengumpulan data yang digunakan yaitu pengamatanlangsung (observasi), Wawancara (Interview) serta Studi Pustaka. Dengan adanya rancangan sistem inidiharapkan dapat digunakan untuk membangun sistem informasi sebagai media penyimpanan datadistribusi dan laporan secara terkomputerisasi serta digunakan untuk membangun sistem informasi dalamupaya mengatur dan mengawasi penyaluran gas elpiji kepada konsumen.&quot;,&quot;issue&quot;:&quot;2&quot;,&quot;volume&quot;:&quot;6&quot;,&quot;container-title-short&quot;:&quot;&quot;},&quot;isTemporary&quot;:false,&quot;suppress-author&quot;:false,&quot;composite&quot;:false,&quot;author-only&quot;:false}]},{&quot;citationID&quot;:&quot;MENDELEY_CITATION_2833e388-8781-4bbf-aa4a-a5d6711a1b90&quot;,&quot;properties&quot;:{&quot;noteIndex&quot;:0},&quot;isEdited&quot;:false,&quot;manualOverride&quot;:{&quot;isManuallyOverridden&quot;:true,&quot;citeprocText&quot;:&quot;[4]&quot;,&quot;manualOverrideText&quot;:&quot;[4]&quot;},&quot;citationTag&quot;:&quot;MENDELEY_CITATION_v3_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&quot;,&quot;citationItems&quot;:[{&quot;id&quot;:&quot;d4fccd83-9f89-3bda-af40-ca648ecc2094&quot;,&quot;itemData&quot;:{&quot;type&quot;:&quot;report&quot;,&quot;id&quot;:&quot;d4fccd83-9f89-3bda-af40-ca648ecc2094&quot;,&quot;title&quot;:&quot;RANCANG BANGUN SISTEM INFORMASI PENJUALAN GAS LPG 3 KG DI PT. NAFA ENERGI INDONESIA BOTOLINGGO, BONDOWOSO&quot;,&quot;author&quot;:[{&quot;family&quot;:&quot;Dewi&quot;,&quot;given&quot;:&quot;Alfien Fitriana&quot;,&quot;parse-names&quot;:false,&quot;dropping-particle&quot;:&quot;&quot;,&quot;non-dropping-particle&quot;:&quot;&quot;},{&quot;family&quot;:&quot;Ghozali&quot;,&quot;given&quot;:&quot;R M&quot;,&quot;parse-names&quot;:false,&quot;dropping-particle&quot;:&quot;&quot;,&quot;non-dropping-particle&quot;:&quot;&quot;},{&quot;family&quot;:&quot;Budiono&quot;,&quot;given&quot;:&quot;Drs Karim&quot;,&quot;parse-names&quot;:false,&quot;dropping-particle&quot;:&quot;&quot;,&quot;non-dropping-particle&quot;:&quot;&quot;}],&quot;container-title&quot;:&quot;Jurnal Manajemen Bisnis dan Manajemen Keuangan&quot;,&quot;URL&quot;:&quot;www.jurnal.itsm.ac.id&quot;,&quot;issued&quot;:{&quot;date-parts&quot;:[[2023]]},&quot;issue&quot;:&quot;1&quot;,&quot;volume&quot;:&quot;4&quot;,&quot;container-title-short&quot;:&quot;&quot;},&quot;isTemporary&quot;:false,&quot;suppress-author&quot;:false,&quot;composite&quot;:false,&quot;author-only&quot;:false}]},{&quot;citationID&quot;:&quot;MENDELEY_CITATION_f2463c91-1758-4e1a-a68a-4178758a3401&quot;,&quot;properties&quot;:{&quot;noteIndex&quot;:0},&quot;isEdited&quot;:false,&quot;manualOverride&quot;:{&quot;isManuallyOverridden&quot;:false,&quot;citeprocText&quot;:&quot;[5]&quot;,&quot;manualOverrideText&quot;:&quot;&quot;},&quot;citationTag&quot;:&quot;MENDELEY_CITATION_v3_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&quot;,&quot;citationItems&quot;:[{&quot;id&quot;:&quot;a3c0ff9f-903c-3b08-b310-bff01d047c3a&quot;,&quot;itemData&quot;:{&quot;type&quot;:&quot;article-journal&quot;,&quot;id&quot;:&quot;a3c0ff9f-903c-3b08-b310-bff01d047c3a&quot;,&quot;title&quot;:&quot;Optimization of LPG Distribution for a Multiplatform-Based LPG Marketplace&quot;,&quot;author&quot;:[{&quot;family&quot;:&quot;Budianto&quot;,&quot;given&quot;:&quot;Herman&quot;,&quot;parse-names&quot;:false,&quot;dropping-particle&quot;:&quot;&quot;,&quot;non-dropping-particle&quot;:&quot;&quot;},{&quot;family&quot;:&quot;Mustaqin&quot;,&quot;given&quot;:&quot;Farhan Faisal Zainul&quot;,&quot;parse-names&quot;:false,&quot;dropping-particle&quot;:&quot;&quot;,&quot;non-dropping-particle&quot;:&quot;&quot;},{&quot;family&quot;:&quot;Setiawan&quot;,&quot;given&quot;:&quot;Esther Irawati&quot;,&quot;parse-names&quot;:false,&quot;dropping-particle&quot;:&quot;&quot;,&quot;non-dropping-particle&quot;:&quot;&quot;},{&quot;family&quot;:&quot;Santoso&quot;,&quot;given&quot;:&quot;Joan&quot;,&quot;parse-names&quot;:false,&quot;dropping-particle&quot;:&quot;&quot;,&quot;non-dropping-particle&quot;:&quot;&quot;}],&quot;container-title&quot;:&quot;International Journal of Engineering, Science and Information Technology&quot;,&quot;DOI&quot;:&quot;10.52088/ijesty.v5i3.994&quot;,&quot;ISSN&quot;:&quot;27752674&quot;,&quot;issued&quot;:{&quot;date-parts&quot;:[[2025,7,1]]},&quot;page&quot;:&quot;327-336&quot;,&quot;abstract&quot;:&quot;Marketplace applications have become an essential digital solution supporting online transactions, including LPG distribution. The development of this application adopts a multiplatform approach, enabling the application to run on various devices, particularly Android platforms and websites. Using the React Native framework, developers can build applications with a single, efficient codebase for multiple platforms. This study aims to provide users with convenience in purchasing LPG without leaving their homes while offering a more practical and effective user experience. This research includes features for selling, buying, payment, and delivery via courier. The transaction feature facilitates sellers' recording of sales within the application. The results of alpha testing indicate that the Elpijiku marketplace app works well despite some significant errors or bugs. However, acceptance testing results were very positive, with 91% of respondents rating the application and user experience as good. These findings indicate that the Elpijiku application meets user needs in terms of convenience and efficiency and is suitable for use as a digital solution for LPG distribution.&quot;,&quot;publisher&quot;:&quot;Malikussaleh University&quot;,&quot;issue&quot;:&quot;3&quot;,&quot;volume&quot;:&quot;5&quot;,&quot;container-title-short&quot;:&quot;&quot;},&quot;isTemporary&quot;:false,&quot;suppress-author&quot;:false,&quot;composite&quot;:false,&quot;author-only&quot;:false}]},{&quot;citationID&quot;:&quot;MENDELEY_CITATION_7c0e0535-7ea8-430c-a72d-bc559c76b557&quot;,&quot;properties&quot;:{&quot;noteIndex&quot;:0},&quot;isEdited&quot;:false,&quot;manualOverride&quot;:{&quot;isManuallyOverridden&quot;:false,&quot;citeprocText&quot;:&quot;[11]&quot;,&quot;manualOverrideText&quot;:&quot;&quot;},&quot;citationTag&quot;:&quot;MENDELEY_CITATION_v3_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&quot;,&quot;citationItems&quot;:[{&quot;id&quot;:&quot;481de7de-fc4e-3c4e-96aa-2fa68b24042c&quot;,&quot;itemData&quot;:{&quot;type&quot;:&quot;report&quot;,&quot;id&quot;:&quot;481de7de-fc4e-3c4e-96aa-2fa68b24042c&quot;,&quot;title&quot;:&quot;SISTEM INFORMASI PENDISTRIBUSIAN GAS LPG 3KG PADA PT. CLIENSA SATRIA CITA GEMILANG DI KABUPATEN SUBANG&quot;,&quot;author&quot;:[{&quot;family&quot;:&quot;Tjahjo Utomo&quot;,&quot;given&quot;:&quot;Bambang&quot;,&quot;parse-names&quot;:false,&quot;dropping-particle&quot;:&quot;&quot;,&quot;non-dropping-particle&quot;:&quot;&quot;},{&quot;family&quot;:&quot;Destriani&quot;,&quot;given&quot;:&quot;Maya&quot;,&quot;parse-names&quot;:false,&quot;dropping-particle&quot;:&quot;&quot;,&quot;non-dropping-particle&quot;:&quot;&quot;},{&quot;family&quot;:&quot;Komputer&quot;,&quot;given&quot;:&quot;Ilmu&quot;,&quot;parse-names&quot;:false,&quot;dropping-particle&quot;:&quot;&quot;,&quot;non-dropping-particle&quot;:&quot;&quot;},{&quot;family&quot;:&quot;Subang&quot;,&quot;given&quot;:&quot;Universitas&quot;,&quot;parse-names&quot;:false,&quot;dropping-particle&quot;:&quot;&quot;,&quot;non-dropping-particle&quot;:&quot;&quot;}],&quot;URL&quot;:&quot;http://ejournal.unsub.ac.id/index.php/Fasilkom&quot;,&quot;issued&quot;:{&quot;date-parts&quot;:[[2022]]},&quot;issue&quot;:&quot;2&quot;,&quot;volume&quot;:&quot;VIII&quot;,&quot;container-title-short&quot;:&quot;&quot;},&quot;isTemporary&quot;:false,&quot;suppress-author&quot;:false,&quot;composite&quot;:false,&quot;author-only&quot;:false}]}]"/>
     <we:property name="MENDELEY_CITATIONS_STYLE" value="{&quot;id&quot;:&quot;https://www.zotero.org/styles/ieee&quot;,&quot;title&quot;:&quot;IEEE&quot;,&quot;format&quot;:&quot;numeric&quot;,&quot;defaultLocale&quot;:null,&quot;isLocaleCodeValid&quot;:true}"/>
   </we:properties>
   <we:bindings/>

</xml_diff>